<commit_message>
modified:   .ai/cerebrum.md 	modified:   .gitignore 	new file:   certificate_Manager.md 	modified:   certificates/year - Temp - En - D - SBS - Adian Abdulameer Fakhri Al-Asadi.docx 	modified:   data/repositories.py 	modified:   db.py 	modified:   screens/students_screen.py 	modified:   system_log.txt
</commit_message>
<xml_diff>
--- a/certificates/year - Temp - En - D - SBS - Adian Abdulameer Fakhri Al-Asadi.docx
+++ b/certificates/year - Temp - En - D - SBS - Adian Abdulameer Fakhri Al-Asadi.docx
@@ -133,7 +133,7 @@
           <w:b/>
           <w:bCs/>
         </w:rPr>
-        <w:t xml:space="preserve">To/ Whom it May Concern</w:t>
+        <w:t>To/ Whom it May Concern</w:t>
       </w:r>
     </w:p>
     <w:tbl>
@@ -176,7 +176,7 @@
               </w:rPr>
             </w:pPr>
             <w:r>
-              <w:t xml:space="preserve">Full Name: Adian Abdulameer Fakhri Al-Asadi</w:t>
+              <w:t>Full Name: Adian Abdulameer Fakhri Al-Asadi</w:t>
             </w:r>
           </w:p>
         </w:tc>
@@ -236,7 +236,7 @@
               </w:rPr>
             </w:pPr>
             <w:r>
-              <w:t xml:space="preserve">Place and Date of Birth: ‎1999/11/11‎ -Basra</w:t>
+              <w:t>Place and Date of Birth: ‎1997/01/01‎ -Basra</w:t>
             </w:r>
           </w:p>
         </w:tc>
@@ -258,7 +258,7 @@
               </w:rPr>
             </w:pPr>
             <w:r>
-              <w:t xml:space="preserve">Nationality: Mexico</w:t>
+              <w:t>Nationality: Iraq</w:t>
             </w:r>
           </w:p>
         </w:tc>
@@ -283,7 +283,7 @@
               </w:rPr>
             </w:pPr>
             <w:r>
-              <w:t xml:space="preserve">Year of Entrance: 2015</w:t>
+              <w:t>Year of Entrance: 2015</w:t>
             </w:r>
           </w:p>
         </w:tc>
@@ -305,7 +305,7 @@
               </w:rPr>
             </w:pPr>
             <w:r>
-              <w:t xml:space="preserve">Department: Computer Science</w:t>
+              <w:t>Department: Computer Science</w:t>
             </w:r>
           </w:p>
         </w:tc>
@@ -371,7 +371,7 @@
               </w:rPr>
             </w:pPr>
             <w:r>
-              <w:t xml:space="preserve">Study: Morning</w:t>
+              <w:t xml:space="preserve">Study: </w:t>
             </w:r>
           </w:p>
         </w:tc>
@@ -396,7 +396,7 @@
               </w:rPr>
             </w:pPr>
             <w:r>
-              <w:t xml:space="preserve">Date of Graduation: ‎2020/11/17‎</w:t>
+              <w:t xml:space="preserve">Date of Graduation: </w:t>
             </w:r>
           </w:p>
         </w:tc>
@@ -419,7 +419,7 @@
               </w:rPr>
             </w:pPr>
             <w:r>
-              <w:t xml:space="preserve">Semester:First</w:t>
+              <w:t>Semester:</w:t>
             </w:r>
           </w:p>
         </w:tc>
@@ -442,7 +442,7 @@
               </w:rPr>
             </w:pPr>
             <w:r>
-              <w:t xml:space="preserve">Average:66.896</w:t>
+              <w:t>Average:66.9</w:t>
             </w:r>
           </w:p>
         </w:tc>
@@ -463,7 +463,7 @@
               </w:rPr>
             </w:pPr>
             <w:r>
-              <w:t xml:space="preserve">Grade: Medium</w:t>
+              <w:t>Grade: Medium</w:t>
             </w:r>
           </w:p>
         </w:tc>
@@ -481,7 +481,19 @@
               <w:spacing w:after="0"/>
             </w:pPr>
             <w:r>
-              <w:t xml:space="preserve">Sequence_of_Graduation: 64</w:t>
+              <w:t>Sequence</w:t>
+            </w:r>
+            <w:r>
+              <w:t xml:space="preserve"> </w:t>
+            </w:r>
+            <w:r>
+              <w:t>of</w:t>
+            </w:r>
+            <w:r>
+              <w:t xml:space="preserve"> </w:t>
+            </w:r>
+            <w:r>
+              <w:t>Graduation: 64</w:t>
             </w:r>
           </w:p>
         </w:tc>
@@ -503,7 +515,7 @@
               </w:rPr>
             </w:pPr>
             <w:r>
-              <w:t xml:space="preserve">Postgraduation No.: 2</w:t>
+              <w:t>Postgraduation No.: 89</w:t>
             </w:r>
           </w:p>
         </w:tc>
@@ -520,7 +532,25 @@
               <w:spacing w:after="0"/>
             </w:pPr>
             <w:r>
-              <w:t xml:space="preserve">Average_of_First_Student: 66.896</w:t>
+              <w:t>Average</w:t>
+            </w:r>
+            <w:r>
+              <w:t xml:space="preserve"> </w:t>
+            </w:r>
+            <w:r>
+              <w:t>of</w:t>
+            </w:r>
+            <w:r>
+              <w:t xml:space="preserve"> </w:t>
+            </w:r>
+            <w:r>
+              <w:t>First</w:t>
+            </w:r>
+            <w:r>
+              <w:t xml:space="preserve"> </w:t>
+            </w:r>
+            <w:r>
+              <w:t>Student: 86.41999816894531</w:t>
             </w:r>
           </w:p>
         </w:tc>
@@ -593,9 +623,6 @@
         <w:bidi w:val="0"/>
         <w:spacing w:line="240" w:lineRule="auto"/>
       </w:pPr>
-      <w:r>
-        <w:t xml:space="preserve"/>
-      </w:r>
     </w:p>
     <w:tbl>
       <w:tblPr>
@@ -639,7 +666,15 @@
                 <w:sz w:val="18"/>
                 <w:szCs w:val="18"/>
               </w:rPr>
-              <w:t xml:space="preserve">Year: 2017-2018</w:t>
+              <w:t>2016 (1)</w:t>
+            </w:r>
+            <w:r>
+              <w:rPr>
+                <w:rFonts w:asciiTheme="majorBidi" w:hAnsiTheme="majorBidi" w:cstheme="majorBidi"/>
+                <w:sz w:val="18"/>
+                <w:szCs w:val="18"/>
+              </w:rPr>
+              <w:t xml:space="preserve"> _ Stage </w:t>
             </w:r>
           </w:p>
         </w:tc>
@@ -666,7 +701,15 @@
                 <w:sz w:val="18"/>
                 <w:szCs w:val="18"/>
               </w:rPr>
-              <w:t xml:space="preserve">Year: 2015-2016</w:t>
+              <w:t>2017</w:t>
+            </w:r>
+            <w:r>
+              <w:rPr>
+                <w:rFonts w:asciiTheme="majorBidi" w:hAnsiTheme="majorBidi" w:cstheme="majorBidi"/>
+                <w:sz w:val="18"/>
+                <w:szCs w:val="18"/>
+              </w:rPr>
+              <w:t xml:space="preserve"> _ Stage </w:t>
             </w:r>
           </w:p>
         </w:tc>
@@ -858,7 +901,7 @@
                 <w:sz w:val="18"/>
                 <w:szCs w:val="18"/>
               </w:rPr>
-              <w:t xml:space="preserve">Computer Ethics</w:t>
+              <w:t>English I</w:t>
             </w:r>
           </w:p>
         </w:tc>
@@ -884,7 +927,7 @@
                 <w:sz w:val="18"/>
                 <w:szCs w:val="18"/>
               </w:rPr>
-              <w:t xml:space="preserve">58</w:t>
+              <w:t>74</w:t>
             </w:r>
           </w:p>
         </w:tc>
@@ -910,7 +953,7 @@
                 <w:sz w:val="18"/>
                 <w:szCs w:val="18"/>
               </w:rPr>
-              <w:t xml:space="preserve">2</w:t>
+              <w:t>2</w:t>
             </w:r>
           </w:p>
         </w:tc>
@@ -936,7 +979,7 @@
                 <w:sz w:val="18"/>
                 <w:szCs w:val="18"/>
               </w:rPr>
-              <w:t xml:space="preserve">English I</w:t>
+              <w:t>Probability and Statistics</w:t>
             </w:r>
           </w:p>
         </w:tc>
@@ -962,7 +1005,7 @@
                 <w:sz w:val="18"/>
                 <w:szCs w:val="18"/>
               </w:rPr>
-              <w:t xml:space="preserve">74</w:t>
+              <w:t>53</w:t>
             </w:r>
           </w:p>
         </w:tc>
@@ -988,7 +1031,7 @@
                 <w:sz w:val="18"/>
                 <w:szCs w:val="18"/>
               </w:rPr>
-              <w:t xml:space="preserve">2</w:t>
+              <w:t>3</w:t>
             </w:r>
           </w:p>
         </w:tc>
@@ -1019,7 +1062,7 @@
                 <w:sz w:val="18"/>
                 <w:szCs w:val="18"/>
               </w:rPr>
-              <w:t xml:space="preserve">Artificial Intelligence</w:t>
+              <w:t>Programming I</w:t>
             </w:r>
           </w:p>
         </w:tc>
@@ -1045,7 +1088,7 @@
                 <w:sz w:val="18"/>
                 <w:szCs w:val="18"/>
               </w:rPr>
-              <w:t xml:space="preserve">50</w:t>
+              <w:t>50</w:t>
             </w:r>
           </w:p>
         </w:tc>
@@ -1071,7 +1114,7 @@
                 <w:sz w:val="18"/>
                 <w:szCs w:val="18"/>
               </w:rPr>
-              <w:t xml:space="preserve">3</w:t>
+              <w:t>4</w:t>
             </w:r>
           </w:p>
         </w:tc>
@@ -1097,7 +1140,7 @@
                 <w:sz w:val="18"/>
                 <w:szCs w:val="18"/>
               </w:rPr>
-              <w:t xml:space="preserve">English II</w:t>
+              <w:t>Object-oriented Programming I</w:t>
             </w:r>
           </w:p>
         </w:tc>
@@ -1123,7 +1166,7 @@
                 <w:sz w:val="18"/>
                 <w:szCs w:val="18"/>
               </w:rPr>
-              <w:t xml:space="preserve">70</w:t>
+              <w:t>53</w:t>
             </w:r>
           </w:p>
         </w:tc>
@@ -1149,7 +1192,7 @@
                 <w:sz w:val="18"/>
                 <w:szCs w:val="18"/>
               </w:rPr>
-              <w:t xml:space="preserve">2</w:t>
+              <w:t>3</w:t>
             </w:r>
           </w:p>
         </w:tc>
@@ -1180,7 +1223,7 @@
                 <w:sz w:val="18"/>
                 <w:szCs w:val="18"/>
               </w:rPr>
-              <w:t xml:space="preserve">Compilers</w:t>
+              <w:t>Democracy Education  Human Rights</w:t>
             </w:r>
           </w:p>
         </w:tc>
@@ -1206,7 +1249,7 @@
                 <w:sz w:val="18"/>
                 <w:szCs w:val="18"/>
               </w:rPr>
-              <w:t xml:space="preserve">63</w:t>
+              <w:t>77</w:t>
             </w:r>
           </w:p>
         </w:tc>
@@ -1232,7 +1275,7 @@
                 <w:sz w:val="18"/>
                 <w:szCs w:val="18"/>
               </w:rPr>
-              <w:t xml:space="preserve">4</w:t>
+              <w:t>2</w:t>
             </w:r>
           </w:p>
         </w:tc>
@@ -1258,7 +1301,7 @@
                 <w:sz w:val="18"/>
                 <w:szCs w:val="18"/>
               </w:rPr>
-              <w:t xml:space="preserve">Programming I</w:t>
+              <w:t>Computer Graphics</w:t>
             </w:r>
           </w:p>
         </w:tc>
@@ -1284,7 +1327,7 @@
                 <w:sz w:val="18"/>
                 <w:szCs w:val="18"/>
               </w:rPr>
-              <w:t xml:space="preserve">50</w:t>
+              <w:t>63</w:t>
             </w:r>
           </w:p>
         </w:tc>
@@ -1310,7 +1353,7 @@
                 <w:sz w:val="18"/>
                 <w:szCs w:val="18"/>
               </w:rPr>
-              <w:t xml:space="preserve">4</w:t>
+              <w:t>3</w:t>
             </w:r>
           </w:p>
         </w:tc>
@@ -1341,7 +1384,7 @@
                 <w:sz w:val="18"/>
                 <w:szCs w:val="18"/>
               </w:rPr>
-              <w:t xml:space="preserve">Operations Researches</w:t>
+              <w:t>Mathematic</w:t>
             </w:r>
           </w:p>
         </w:tc>
@@ -1367,7 +1410,7 @@
                 <w:sz w:val="18"/>
                 <w:szCs w:val="18"/>
               </w:rPr>
-              <w:t xml:space="preserve">50</w:t>
+              <w:t>68</w:t>
             </w:r>
           </w:p>
         </w:tc>
@@ -1393,7 +1436,7 @@
                 <w:sz w:val="18"/>
                 <w:szCs w:val="18"/>
               </w:rPr>
-              <w:t xml:space="preserve">3</w:t>
+              <w:t>3</w:t>
             </w:r>
           </w:p>
         </w:tc>
@@ -1419,7 +1462,7 @@
                 <w:sz w:val="18"/>
                 <w:szCs w:val="18"/>
               </w:rPr>
-              <w:t xml:space="preserve">Programming II</w:t>
+              <w:t>Arabic</w:t>
             </w:r>
           </w:p>
         </w:tc>
@@ -1445,7 +1488,7 @@
                 <w:sz w:val="18"/>
                 <w:szCs w:val="18"/>
               </w:rPr>
-              <w:t xml:space="preserve">52</w:t>
+              <w:t>70</w:t>
             </w:r>
           </w:p>
         </w:tc>
@@ -1471,7 +1514,7 @@
                 <w:sz w:val="18"/>
                 <w:szCs w:val="18"/>
               </w:rPr>
-              <w:t xml:space="preserve">4</w:t>
+              <w:t>2</w:t>
             </w:r>
           </w:p>
         </w:tc>
@@ -1502,7 +1545,7 @@
                 <w:sz w:val="18"/>
                 <w:szCs w:val="18"/>
               </w:rPr>
-              <w:t xml:space="preserve">Web Programming I</w:t>
+              <w:t>Healthy and Fitness</w:t>
             </w:r>
           </w:p>
         </w:tc>
@@ -1528,7 +1571,7 @@
                 <w:sz w:val="18"/>
                 <w:szCs w:val="18"/>
               </w:rPr>
-              <w:t xml:space="preserve">58</w:t>
+              <w:t>78</w:t>
             </w:r>
           </w:p>
         </w:tc>
@@ -1554,7 +1597,7 @@
                 <w:sz w:val="18"/>
                 <w:szCs w:val="18"/>
               </w:rPr>
-              <w:t xml:space="preserve">3</w:t>
+              <w:t>2</w:t>
             </w:r>
           </w:p>
         </w:tc>
@@ -1580,7 +1623,7 @@
                 <w:sz w:val="18"/>
                 <w:szCs w:val="18"/>
               </w:rPr>
-              <w:t xml:space="preserve">Logic Design</w:t>
+              <w:t>Microprocessors</w:t>
             </w:r>
           </w:p>
         </w:tc>
@@ -1606,7 +1649,7 @@
                 <w:sz w:val="18"/>
                 <w:szCs w:val="18"/>
               </w:rPr>
-              <w:t xml:space="preserve">50</w:t>
+              <w:t>50</w:t>
             </w:r>
           </w:p>
         </w:tc>
@@ -1632,7 +1675,7 @@
                 <w:sz w:val="18"/>
                 <w:szCs w:val="18"/>
               </w:rPr>
-              <w:t xml:space="preserve">4</w:t>
+              <w:t>3</w:t>
             </w:r>
           </w:p>
         </w:tc>
@@ -1663,7 +1706,7 @@
                 <w:sz w:val="18"/>
                 <w:szCs w:val="18"/>
               </w:rPr>
-              <w:t xml:space="preserve">Web Programming II</w:t>
+              <w:t>Computer Skills</w:t>
             </w:r>
           </w:p>
         </w:tc>
@@ -1689,7 +1732,7 @@
                 <w:sz w:val="18"/>
                 <w:szCs w:val="18"/>
               </w:rPr>
-              <w:t xml:space="preserve">57</w:t>
+              <w:t>73</w:t>
             </w:r>
           </w:p>
         </w:tc>
@@ -1715,7 +1758,7 @@
                 <w:sz w:val="18"/>
                 <w:szCs w:val="18"/>
               </w:rPr>
-              <w:t xml:space="preserve">3</w:t>
+              <w:t>3</w:t>
             </w:r>
           </w:p>
         </w:tc>
@@ -1741,7 +1784,7 @@
                 <w:sz w:val="18"/>
                 <w:szCs w:val="18"/>
               </w:rPr>
-              <w:t xml:space="preserve">Democracy and Human Rights</w:t>
+              <w:t>Systems Analysis and Design</w:t>
             </w:r>
           </w:p>
         </w:tc>
@@ -1767,7 +1810,7 @@
                 <w:sz w:val="18"/>
                 <w:szCs w:val="18"/>
               </w:rPr>
-              <w:t xml:space="preserve">77</w:t>
+              <w:t>50</w:t>
             </w:r>
           </w:p>
         </w:tc>
@@ -1793,1295 +1836,7 @@
                 <w:sz w:val="18"/>
                 <w:szCs w:val="18"/>
               </w:rPr>
-              <w:t xml:space="preserve">2</w:t>
-            </w:r>
-          </w:p>
-        </w:tc>
-      </w:tr>
-      <w:tr>
-        <w:trPr>
-          <w:cantSplit/>
-        </w:trPr>
-        <w:tc>
-          <w:tcPr>
-            <w:tcW w:w="1828" w:type="pct"/>
-          </w:tcPr>
-          <w:p>
-            <w:pPr>
-              <w:keepNext/>
-              <w:keepLines/>
-              <w:bidi w:val="0"/>
-              <w:spacing w:after="0"/>
-              <w:rPr>
-                <w:rFonts w:asciiTheme="majorBidi" w:hAnsiTheme="majorBidi" w:cstheme="majorBidi"/>
-                <w:sz w:val="18"/>
-                <w:szCs w:val="18"/>
-              </w:rPr>
-            </w:pPr>
-            <w:r>
-              <w:rPr>
-                <w:rFonts w:asciiTheme="majorBidi" w:hAnsiTheme="majorBidi" w:cstheme="majorBidi"/>
-                <w:sz w:val="18"/>
-                <w:szCs w:val="18"/>
-              </w:rPr>
-              <w:t xml:space="preserve">Systems Analysis and Design</w:t>
-            </w:r>
-          </w:p>
-        </w:tc>
-        <w:tc>
-          <w:tcPr>
-            <w:tcW w:w="338" w:type="pct"/>
-          </w:tcPr>
-          <w:p>
-            <w:pPr>
-              <w:keepNext/>
-              <w:keepLines/>
-              <w:bidi w:val="0"/>
-              <w:spacing w:after="0"/>
-              <w:rPr>
-                <w:rFonts w:asciiTheme="majorBidi" w:hAnsiTheme="majorBidi" w:cstheme="majorBidi"/>
-                <w:sz w:val="18"/>
-                <w:szCs w:val="18"/>
-              </w:rPr>
-            </w:pPr>
-            <w:r>
-              <w:rPr>
-                <w:rFonts w:asciiTheme="majorBidi" w:hAnsiTheme="majorBidi" w:cstheme="majorBidi"/>
-                <w:sz w:val="18"/>
-                <w:szCs w:val="18"/>
-              </w:rPr>
-              <w:t xml:space="preserve">50</w:t>
-            </w:r>
-          </w:p>
-        </w:tc>
-        <w:tc>
-          <w:tcPr>
-            <w:tcW w:w="339" w:type="pct"/>
-          </w:tcPr>
-          <w:p>
-            <w:pPr>
-              <w:keepNext/>
-              <w:keepLines/>
-              <w:bidi w:val="0"/>
-              <w:spacing w:after="0"/>
-              <w:rPr>
-                <w:rFonts w:asciiTheme="majorBidi" w:hAnsiTheme="majorBidi" w:cstheme="majorBidi"/>
-                <w:sz w:val="18"/>
-                <w:szCs w:val="18"/>
-              </w:rPr>
-            </w:pPr>
-            <w:r>
-              <w:rPr>
-                <w:rFonts w:asciiTheme="majorBidi" w:hAnsiTheme="majorBidi" w:cstheme="majorBidi"/>
-                <w:sz w:val="18"/>
-                <w:szCs w:val="18"/>
-              </w:rPr>
-              <w:t xml:space="preserve">3</w:t>
-            </w:r>
-          </w:p>
-        </w:tc>
-        <w:tc>
-          <w:tcPr>
-            <w:tcW w:w="1831" w:type="pct"/>
-          </w:tcPr>
-          <w:p>
-            <w:pPr>
-              <w:keepNext/>
-              <w:keepLines/>
-              <w:bidi w:val="0"/>
-              <w:spacing w:after="0"/>
-              <w:rPr>
-                <w:rFonts w:asciiTheme="majorBidi" w:hAnsiTheme="majorBidi" w:cstheme="majorBidi"/>
-                <w:sz w:val="18"/>
-                <w:szCs w:val="18"/>
-              </w:rPr>
-            </w:pPr>
-            <w:r>
-              <w:rPr>
-                <w:rFonts w:asciiTheme="majorBidi" w:hAnsiTheme="majorBidi" w:cstheme="majorBidi"/>
-                <w:sz w:val="18"/>
-                <w:szCs w:val="18"/>
-              </w:rPr>
-              <w:t xml:space="preserve">Mathematic</w:t>
-            </w:r>
-          </w:p>
-        </w:tc>
-        <w:tc>
-          <w:tcPr>
-            <w:tcW w:w="339" w:type="pct"/>
-          </w:tcPr>
-          <w:p>
-            <w:pPr>
-              <w:keepNext/>
-              <w:keepLines/>
-              <w:bidi w:val="0"/>
-              <w:spacing w:after="0"/>
-              <w:rPr>
-                <w:rFonts w:asciiTheme="majorBidi" w:hAnsiTheme="majorBidi" w:cstheme="majorBidi"/>
-                <w:sz w:val="18"/>
-                <w:szCs w:val="18"/>
-              </w:rPr>
-            </w:pPr>
-            <w:r>
-              <w:rPr>
-                <w:rFonts w:asciiTheme="majorBidi" w:hAnsiTheme="majorBidi" w:cstheme="majorBidi"/>
-                <w:sz w:val="18"/>
-                <w:szCs w:val="18"/>
-              </w:rPr>
-              <w:t xml:space="preserve">68</w:t>
-            </w:r>
-          </w:p>
-        </w:tc>
-        <w:tc>
-          <w:tcPr>
-            <w:tcW w:w="325" w:type="pct"/>
-          </w:tcPr>
-          <w:p>
-            <w:pPr>
-              <w:keepNext/>
-              <w:keepLines/>
-              <w:bidi w:val="0"/>
-              <w:spacing w:after="0"/>
-              <w:rPr>
-                <w:rFonts w:asciiTheme="majorBidi" w:hAnsiTheme="majorBidi" w:cstheme="majorBidi"/>
-                <w:sz w:val="18"/>
-                <w:szCs w:val="18"/>
-              </w:rPr>
-            </w:pPr>
-            <w:r>
-              <w:rPr>
-                <w:rFonts w:asciiTheme="majorBidi" w:hAnsiTheme="majorBidi" w:cstheme="majorBidi"/>
-                <w:sz w:val="18"/>
-                <w:szCs w:val="18"/>
-              </w:rPr>
-              <w:t xml:space="preserve">3</w:t>
-            </w:r>
-          </w:p>
-        </w:tc>
-      </w:tr>
-      <w:tr>
-        <w:trPr>
-          <w:cantSplit/>
-        </w:trPr>
-        <w:tc>
-          <w:tcPr>
-            <w:tcW w:w="1828" w:type="pct"/>
-          </w:tcPr>
-          <w:p>
-            <w:pPr>
-              <w:keepNext/>
-              <w:keepLines/>
-              <w:bidi w:val="0"/>
-              <w:spacing w:after="0"/>
-              <w:rPr>
-                <w:rFonts w:asciiTheme="majorBidi" w:hAnsiTheme="majorBidi" w:cstheme="majorBidi"/>
-                <w:sz w:val="18"/>
-                <w:szCs w:val="18"/>
-              </w:rPr>
-            </w:pPr>
-            <w:r>
-              <w:rPr>
-                <w:rFonts w:asciiTheme="majorBidi" w:hAnsiTheme="majorBidi" w:cstheme="majorBidi"/>
-                <w:sz w:val="18"/>
-                <w:szCs w:val="18"/>
-              </w:rPr>
-              <w:t xml:space="preserve">Computer Networks I</w:t>
-            </w:r>
-          </w:p>
-        </w:tc>
-        <w:tc>
-          <w:tcPr>
-            <w:tcW w:w="338" w:type="pct"/>
-          </w:tcPr>
-          <w:p>
-            <w:pPr>
-              <w:keepNext/>
-              <w:keepLines/>
-              <w:bidi w:val="0"/>
-              <w:spacing w:after="0"/>
-              <w:rPr>
-                <w:rFonts w:asciiTheme="majorBidi" w:hAnsiTheme="majorBidi" w:cstheme="majorBidi"/>
-                <w:sz w:val="18"/>
-                <w:szCs w:val="18"/>
-              </w:rPr>
-            </w:pPr>
-            <w:r>
-              <w:rPr>
-                <w:rFonts w:asciiTheme="majorBidi" w:hAnsiTheme="majorBidi" w:cstheme="majorBidi"/>
-                <w:sz w:val="18"/>
-                <w:szCs w:val="18"/>
-              </w:rPr>
-              <w:t xml:space="preserve">50</w:t>
-            </w:r>
-          </w:p>
-        </w:tc>
-        <w:tc>
-          <w:tcPr>
-            <w:tcW w:w="339" w:type="pct"/>
-          </w:tcPr>
-          <w:p>
-            <w:pPr>
-              <w:keepNext/>
-              <w:keepLines/>
-              <w:bidi w:val="0"/>
-              <w:spacing w:after="0"/>
-              <w:rPr>
-                <w:rFonts w:asciiTheme="majorBidi" w:hAnsiTheme="majorBidi" w:cstheme="majorBidi"/>
-                <w:sz w:val="18"/>
-                <w:szCs w:val="18"/>
-              </w:rPr>
-            </w:pPr>
-            <w:r>
-              <w:rPr>
-                <w:rFonts w:asciiTheme="majorBidi" w:hAnsiTheme="majorBidi" w:cstheme="majorBidi"/>
-                <w:sz w:val="18"/>
-                <w:szCs w:val="18"/>
-              </w:rPr>
-              <w:t xml:space="preserve">3</w:t>
-            </w:r>
-          </w:p>
-        </w:tc>
-        <w:tc>
-          <w:tcPr>
-            <w:tcW w:w="1831" w:type="pct"/>
-          </w:tcPr>
-          <w:p>
-            <w:pPr>
-              <w:keepNext/>
-              <w:keepLines/>
-              <w:bidi w:val="0"/>
-              <w:spacing w:after="0"/>
-              <w:rPr>
-                <w:rFonts w:asciiTheme="majorBidi" w:hAnsiTheme="majorBidi" w:cstheme="majorBidi"/>
-                <w:sz w:val="18"/>
-                <w:szCs w:val="18"/>
-              </w:rPr>
-            </w:pPr>
-            <w:r>
-              <w:rPr>
-                <w:rFonts w:asciiTheme="majorBidi" w:hAnsiTheme="majorBidi" w:cstheme="majorBidi"/>
-                <w:sz w:val="18"/>
-                <w:szCs w:val="18"/>
-              </w:rPr>
-              <w:t xml:space="preserve">Health and Fitness</w:t>
-            </w:r>
-          </w:p>
-        </w:tc>
-        <w:tc>
-          <w:tcPr>
-            <w:tcW w:w="339" w:type="pct"/>
-          </w:tcPr>
-          <w:p>
-            <w:pPr>
-              <w:keepNext/>
-              <w:keepLines/>
-              <w:bidi w:val="0"/>
-              <w:spacing w:after="0"/>
-              <w:rPr>
-                <w:rFonts w:asciiTheme="majorBidi" w:hAnsiTheme="majorBidi" w:cstheme="majorBidi"/>
-                <w:sz w:val="18"/>
-                <w:szCs w:val="18"/>
-              </w:rPr>
-            </w:pPr>
-            <w:r>
-              <w:rPr>
-                <w:rFonts w:asciiTheme="majorBidi" w:hAnsiTheme="majorBidi" w:cstheme="majorBidi"/>
-                <w:sz w:val="18"/>
-                <w:szCs w:val="18"/>
-              </w:rPr>
-              <w:t xml:space="preserve">78</w:t>
-            </w:r>
-          </w:p>
-        </w:tc>
-        <w:tc>
-          <w:tcPr>
-            <w:tcW w:w="325" w:type="pct"/>
-          </w:tcPr>
-          <w:p>
-            <w:pPr>
-              <w:keepNext/>
-              <w:keepLines/>
-              <w:bidi w:val="0"/>
-              <w:spacing w:after="0"/>
-              <w:rPr>
-                <w:rFonts w:asciiTheme="majorBidi" w:hAnsiTheme="majorBidi" w:cstheme="majorBidi"/>
-                <w:sz w:val="18"/>
-                <w:szCs w:val="18"/>
-              </w:rPr>
-            </w:pPr>
-            <w:r>
-              <w:rPr>
-                <w:rFonts w:asciiTheme="majorBidi" w:hAnsiTheme="majorBidi" w:cstheme="majorBidi"/>
-                <w:sz w:val="18"/>
-                <w:szCs w:val="18"/>
-              </w:rPr>
-              <w:t xml:space="preserve">2</w:t>
-            </w:r>
-          </w:p>
-        </w:tc>
-      </w:tr>
-      <w:tr>
-        <w:trPr>
-          <w:cantSplit/>
-        </w:trPr>
-        <w:tc>
-          <w:tcPr>
-            <w:tcW w:w="1828" w:type="pct"/>
-          </w:tcPr>
-          <w:p>
-            <w:pPr>
-              <w:keepNext/>
-              <w:keepLines/>
-              <w:bidi w:val="0"/>
-              <w:spacing w:after="0"/>
-              <w:rPr>
-                <w:rFonts w:asciiTheme="majorBidi" w:hAnsiTheme="majorBidi" w:cstheme="majorBidi"/>
-                <w:sz w:val="18"/>
-                <w:szCs w:val="18"/>
-              </w:rPr>
-            </w:pPr>
-            <w:r>
-              <w:rPr>
-                <w:rFonts w:asciiTheme="majorBidi" w:hAnsiTheme="majorBidi" w:cstheme="majorBidi"/>
-                <w:sz w:val="18"/>
-                <w:szCs w:val="18"/>
-              </w:rPr>
-              <w:t xml:space="preserve">Computer Networks II</w:t>
-            </w:r>
-          </w:p>
-        </w:tc>
-        <w:tc>
-          <w:tcPr>
-            <w:tcW w:w="338" w:type="pct"/>
-          </w:tcPr>
-          <w:p>
-            <w:pPr>
-              <w:keepNext/>
-              <w:keepLines/>
-              <w:bidi w:val="0"/>
-              <w:spacing w:after="0"/>
-              <w:rPr>
-                <w:rFonts w:asciiTheme="majorBidi" w:hAnsiTheme="majorBidi" w:cstheme="majorBidi"/>
-                <w:sz w:val="18"/>
-                <w:szCs w:val="18"/>
-              </w:rPr>
-            </w:pPr>
-            <w:r>
-              <w:rPr>
-                <w:rFonts w:asciiTheme="majorBidi" w:hAnsiTheme="majorBidi" w:cstheme="majorBidi"/>
-                <w:sz w:val="18"/>
-                <w:szCs w:val="18"/>
-              </w:rPr>
-              <w:t xml:space="preserve">50</w:t>
-            </w:r>
-          </w:p>
-        </w:tc>
-        <w:tc>
-          <w:tcPr>
-            <w:tcW w:w="339" w:type="pct"/>
-          </w:tcPr>
-          <w:p>
-            <w:pPr>
-              <w:keepNext/>
-              <w:keepLines/>
-              <w:bidi w:val="0"/>
-              <w:spacing w:after="0"/>
-              <w:rPr>
-                <w:rFonts w:asciiTheme="majorBidi" w:hAnsiTheme="majorBidi" w:cstheme="majorBidi"/>
-                <w:sz w:val="18"/>
-                <w:szCs w:val="18"/>
-              </w:rPr>
-            </w:pPr>
-            <w:r>
-              <w:rPr>
-                <w:rFonts w:asciiTheme="majorBidi" w:hAnsiTheme="majorBidi" w:cstheme="majorBidi"/>
-                <w:sz w:val="18"/>
-                <w:szCs w:val="18"/>
-              </w:rPr>
-              <w:t xml:space="preserve">3</w:t>
-            </w:r>
-          </w:p>
-        </w:tc>
-        <w:tc>
-          <w:tcPr>
-            <w:tcW w:w="1831" w:type="pct"/>
-          </w:tcPr>
-          <w:p>
-            <w:pPr>
-              <w:keepNext/>
-              <w:keepLines/>
-              <w:bidi w:val="0"/>
-              <w:spacing w:after="0"/>
-              <w:rPr>
-                <w:rFonts w:asciiTheme="majorBidi" w:hAnsiTheme="majorBidi" w:cstheme="majorBidi"/>
-                <w:sz w:val="18"/>
-                <w:szCs w:val="18"/>
-              </w:rPr>
-            </w:pPr>
-            <w:r>
-              <w:rPr>
-                <w:rFonts w:asciiTheme="majorBidi" w:hAnsiTheme="majorBidi" w:cstheme="majorBidi"/>
-                <w:sz w:val="18"/>
-                <w:szCs w:val="18"/>
-              </w:rPr>
-              <w:t xml:space="preserve">Discrete Structures</w:t>
-            </w:r>
-          </w:p>
-        </w:tc>
-        <w:tc>
-          <w:tcPr>
-            <w:tcW w:w="339" w:type="pct"/>
-          </w:tcPr>
-          <w:p>
-            <w:pPr>
-              <w:keepNext/>
-              <w:keepLines/>
-              <w:bidi w:val="0"/>
-              <w:spacing w:after="0"/>
-              <w:rPr>
-                <w:rFonts w:asciiTheme="majorBidi" w:hAnsiTheme="majorBidi" w:cstheme="majorBidi"/>
-                <w:sz w:val="18"/>
-                <w:szCs w:val="18"/>
-              </w:rPr>
-            </w:pPr>
-            <w:r>
-              <w:rPr>
-                <w:rFonts w:asciiTheme="majorBidi" w:hAnsiTheme="majorBidi" w:cstheme="majorBidi"/>
-                <w:sz w:val="18"/>
-                <w:szCs w:val="18"/>
-              </w:rPr>
-              <w:t xml:space="preserve">62</w:t>
-            </w:r>
-          </w:p>
-        </w:tc>
-        <w:tc>
-          <w:tcPr>
-            <w:tcW w:w="325" w:type="pct"/>
-          </w:tcPr>
-          <w:p>
-            <w:pPr>
-              <w:keepNext/>
-              <w:keepLines/>
-              <w:bidi w:val="0"/>
-              <w:spacing w:after="0"/>
-              <w:rPr>
-                <w:rFonts w:asciiTheme="majorBidi" w:hAnsiTheme="majorBidi" w:cstheme="majorBidi"/>
-                <w:sz w:val="18"/>
-                <w:szCs w:val="18"/>
-              </w:rPr>
-            </w:pPr>
-            <w:r>
-              <w:rPr>
-                <w:rFonts w:asciiTheme="majorBidi" w:hAnsiTheme="majorBidi" w:cstheme="majorBidi"/>
-                <w:sz w:val="18"/>
-                <w:szCs w:val="18"/>
-              </w:rPr>
-              <w:t xml:space="preserve">3</w:t>
-            </w:r>
-          </w:p>
-        </w:tc>
-      </w:tr>
-      <w:tr>
-        <w:trPr>
-          <w:cantSplit/>
-        </w:trPr>
-        <w:tc>
-          <w:tcPr>
-            <w:tcW w:w="1828" w:type="pct"/>
-          </w:tcPr>
-          <w:p>
-            <w:pPr>
-              <w:keepNext/>
-              <w:keepLines/>
-              <w:bidi w:val="0"/>
-              <w:spacing w:after="0"/>
-              <w:rPr>
-                <w:rFonts w:asciiTheme="majorBidi" w:hAnsiTheme="majorBidi" w:cstheme="majorBidi"/>
-                <w:sz w:val="18"/>
-                <w:szCs w:val="18"/>
-              </w:rPr>
-            </w:pPr>
-            <w:r>
-              <w:rPr>
-                <w:rFonts w:asciiTheme="majorBidi" w:hAnsiTheme="majorBidi" w:cstheme="majorBidi"/>
-                <w:sz w:val="18"/>
-                <w:szCs w:val="18"/>
-              </w:rPr>
-              <w:t xml:space="preserve">Database</w:t>
-            </w:r>
-          </w:p>
-        </w:tc>
-        <w:tc>
-          <w:tcPr>
-            <w:tcW w:w="338" w:type="pct"/>
-          </w:tcPr>
-          <w:p>
-            <w:pPr>
-              <w:keepNext/>
-              <w:keepLines/>
-              <w:bidi w:val="0"/>
-              <w:spacing w:after="0"/>
-              <w:rPr>
-                <w:rFonts w:asciiTheme="majorBidi" w:hAnsiTheme="majorBidi" w:cstheme="majorBidi"/>
-                <w:sz w:val="18"/>
-                <w:szCs w:val="18"/>
-              </w:rPr>
-            </w:pPr>
-            <w:r>
-              <w:rPr>
-                <w:rFonts w:asciiTheme="majorBidi" w:hAnsiTheme="majorBidi" w:cstheme="majorBidi"/>
-                <w:sz w:val="18"/>
-                <w:szCs w:val="18"/>
-              </w:rPr>
-              <w:t xml:space="preserve">55</w:t>
-            </w:r>
-          </w:p>
-        </w:tc>
-        <w:tc>
-          <w:tcPr>
-            <w:tcW w:w="339" w:type="pct"/>
-          </w:tcPr>
-          <w:p>
-            <w:pPr>
-              <w:keepNext/>
-              <w:keepLines/>
-              <w:bidi w:val="0"/>
-              <w:spacing w:after="0"/>
-              <w:rPr>
-                <w:rFonts w:asciiTheme="majorBidi" w:hAnsiTheme="majorBidi" w:cstheme="majorBidi"/>
-                <w:sz w:val="18"/>
-                <w:szCs w:val="18"/>
-              </w:rPr>
-            </w:pPr>
-            <w:r>
-              <w:rPr>
-                <w:rFonts w:asciiTheme="majorBidi" w:hAnsiTheme="majorBidi" w:cstheme="majorBidi"/>
-                <w:sz w:val="18"/>
-                <w:szCs w:val="18"/>
-              </w:rPr>
-              <w:t xml:space="preserve">3</w:t>
-            </w:r>
-          </w:p>
-        </w:tc>
-        <w:tc>
-          <w:tcPr>
-            <w:tcW w:w="1831" w:type="pct"/>
-          </w:tcPr>
-          <w:p>
-            <w:pPr>
-              <w:keepNext/>
-              <w:keepLines/>
-              <w:bidi w:val="0"/>
-              <w:spacing w:after="0"/>
-              <w:rPr>
-                <w:rFonts w:asciiTheme="majorBidi" w:hAnsiTheme="majorBidi" w:cstheme="majorBidi"/>
-                <w:sz w:val="18"/>
-                <w:szCs w:val="18"/>
-              </w:rPr>
-            </w:pPr>
-            <w:r>
-              <w:rPr>
-                <w:rFonts w:asciiTheme="majorBidi" w:hAnsiTheme="majorBidi" w:cstheme="majorBidi"/>
-                <w:sz w:val="18"/>
-                <w:szCs w:val="18"/>
-              </w:rPr>
-              <w:t xml:space="preserve">Computer Applications</w:t>
-            </w:r>
-          </w:p>
-        </w:tc>
-        <w:tc>
-          <w:tcPr>
-            <w:tcW w:w="339" w:type="pct"/>
-          </w:tcPr>
-          <w:p>
-            <w:pPr>
-              <w:keepNext/>
-              <w:keepLines/>
-              <w:bidi w:val="0"/>
-              <w:spacing w:after="0"/>
-              <w:rPr>
-                <w:rFonts w:asciiTheme="majorBidi" w:hAnsiTheme="majorBidi" w:cstheme="majorBidi"/>
-                <w:sz w:val="18"/>
-                <w:szCs w:val="18"/>
-              </w:rPr>
-            </w:pPr>
-            <w:r>
-              <w:rPr>
-                <w:rFonts w:asciiTheme="majorBidi" w:hAnsiTheme="majorBidi" w:cstheme="majorBidi"/>
-                <w:sz w:val="18"/>
-                <w:szCs w:val="18"/>
-              </w:rPr>
-              <w:t xml:space="preserve">54</w:t>
-            </w:r>
-          </w:p>
-        </w:tc>
-        <w:tc>
-          <w:tcPr>
-            <w:tcW w:w="325" w:type="pct"/>
-          </w:tcPr>
-          <w:p>
-            <w:pPr>
-              <w:keepNext/>
-              <w:keepLines/>
-              <w:bidi w:val="0"/>
-              <w:spacing w:after="0"/>
-              <w:rPr>
-                <w:rFonts w:asciiTheme="majorBidi" w:hAnsiTheme="majorBidi" w:cstheme="majorBidi"/>
-                <w:sz w:val="18"/>
-                <w:szCs w:val="18"/>
-              </w:rPr>
-            </w:pPr>
-            <w:r>
-              <w:rPr>
-                <w:rFonts w:asciiTheme="majorBidi" w:hAnsiTheme="majorBidi" w:cstheme="majorBidi"/>
-                <w:sz w:val="18"/>
-                <w:szCs w:val="18"/>
-              </w:rPr>
-              <w:t xml:space="preserve">3</w:t>
-            </w:r>
-          </w:p>
-        </w:tc>
-      </w:tr>
-      <w:tr>
-        <w:trPr>
-          <w:cantSplit/>
-        </w:trPr>
-        <w:tc>
-          <w:tcPr>
-            <w:tcW w:w="1828" w:type="pct"/>
-          </w:tcPr>
-          <w:p>
-            <w:pPr>
-              <w:keepNext/>
-              <w:keepLines/>
-              <w:bidi w:val="0"/>
-              <w:spacing w:after="0"/>
-              <w:rPr>
-                <w:rFonts w:asciiTheme="majorBidi" w:hAnsiTheme="majorBidi" w:cstheme="majorBidi"/>
-                <w:sz w:val="18"/>
-                <w:szCs w:val="18"/>
-              </w:rPr>
-            </w:pPr>
-            <w:r>
-              <w:rPr>
-                <w:rFonts w:asciiTheme="majorBidi" w:hAnsiTheme="majorBidi" w:cstheme="majorBidi"/>
-                <w:sz w:val="18"/>
-                <w:szCs w:val="18"/>
-              </w:rPr>
-              <w:t xml:space="preserve">Computer Architecture</w:t>
-            </w:r>
-          </w:p>
-        </w:tc>
-        <w:tc>
-          <w:tcPr>
-            <w:tcW w:w="338" w:type="pct"/>
-          </w:tcPr>
-          <w:p>
-            <w:pPr>
-              <w:keepNext/>
-              <w:keepLines/>
-              <w:bidi w:val="0"/>
-              <w:spacing w:after="0"/>
-              <w:rPr>
-                <w:rFonts w:asciiTheme="majorBidi" w:hAnsiTheme="majorBidi" w:cstheme="majorBidi"/>
-                <w:sz w:val="18"/>
-                <w:szCs w:val="18"/>
-              </w:rPr>
-            </w:pPr>
-            <w:r>
-              <w:rPr>
-                <w:rFonts w:asciiTheme="majorBidi" w:hAnsiTheme="majorBidi" w:cstheme="majorBidi"/>
-                <w:sz w:val="18"/>
-                <w:szCs w:val="18"/>
-              </w:rPr>
-              <w:t xml:space="preserve">51</w:t>
-            </w:r>
-          </w:p>
-        </w:tc>
-        <w:tc>
-          <w:tcPr>
-            <w:tcW w:w="339" w:type="pct"/>
-          </w:tcPr>
-          <w:p>
-            <w:pPr>
-              <w:keepNext/>
-              <w:keepLines/>
-              <w:bidi w:val="0"/>
-              <w:spacing w:after="0"/>
-              <w:rPr>
-                <w:rFonts w:asciiTheme="majorBidi" w:hAnsiTheme="majorBidi" w:cstheme="majorBidi"/>
-                <w:sz w:val="18"/>
-                <w:szCs w:val="18"/>
-              </w:rPr>
-            </w:pPr>
-            <w:r>
-              <w:rPr>
-                <w:rFonts w:asciiTheme="majorBidi" w:hAnsiTheme="majorBidi" w:cstheme="majorBidi"/>
-                <w:sz w:val="18"/>
-                <w:szCs w:val="18"/>
-              </w:rPr>
-              <w:t xml:space="preserve">3</w:t>
-            </w:r>
-          </w:p>
-        </w:tc>
-        <w:tc>
-          <w:tcPr>
-            <w:tcW w:w="1831" w:type="pct"/>
-          </w:tcPr>
-          <w:p>
-            <w:pPr>
-              <w:keepNext/>
-              <w:keepLines/>
-              <w:bidi w:val="0"/>
-              <w:spacing w:after="0"/>
-              <w:rPr>
-                <w:rFonts w:asciiTheme="majorBidi" w:hAnsiTheme="majorBidi" w:cstheme="majorBidi"/>
-                <w:sz w:val="18"/>
-                <w:szCs w:val="18"/>
-              </w:rPr>
-            </w:pPr>
-            <w:r>
-              <w:rPr>
-                <w:rFonts w:asciiTheme="majorBidi" w:hAnsiTheme="majorBidi" w:cstheme="majorBidi"/>
-                <w:sz w:val="18"/>
-                <w:szCs w:val="18"/>
-              </w:rPr>
-              <w:t xml:space="preserve">Principle of Information Technology</w:t>
-            </w:r>
-          </w:p>
-        </w:tc>
-        <w:tc>
-          <w:tcPr>
-            <w:tcW w:w="339" w:type="pct"/>
-          </w:tcPr>
-          <w:p>
-            <w:pPr>
-              <w:keepNext/>
-              <w:keepLines/>
-              <w:bidi w:val="0"/>
-              <w:spacing w:after="0"/>
-              <w:rPr>
-                <w:rFonts w:asciiTheme="majorBidi" w:hAnsiTheme="majorBidi" w:cstheme="majorBidi"/>
-                <w:sz w:val="18"/>
-                <w:szCs w:val="18"/>
-              </w:rPr>
-            </w:pPr>
-            <w:r>
-              <w:rPr>
-                <w:rFonts w:asciiTheme="majorBidi" w:hAnsiTheme="majorBidi" w:cstheme="majorBidi"/>
-                <w:sz w:val="18"/>
-                <w:szCs w:val="18"/>
-              </w:rPr>
-              <w:t xml:space="preserve">63</w:t>
-            </w:r>
-          </w:p>
-        </w:tc>
-        <w:tc>
-          <w:tcPr>
-            <w:tcW w:w="325" w:type="pct"/>
-          </w:tcPr>
-          <w:p>
-            <w:pPr>
-              <w:keepNext/>
-              <w:keepLines/>
-              <w:bidi w:val="0"/>
-              <w:spacing w:after="0"/>
-              <w:rPr>
-                <w:rFonts w:asciiTheme="majorBidi" w:hAnsiTheme="majorBidi" w:cstheme="majorBidi"/>
-                <w:sz w:val="18"/>
-                <w:szCs w:val="18"/>
-              </w:rPr>
-            </w:pPr>
-            <w:r>
-              <w:rPr>
-                <w:rFonts w:asciiTheme="majorBidi" w:hAnsiTheme="majorBidi" w:cstheme="majorBidi"/>
-                <w:sz w:val="18"/>
-                <w:szCs w:val="18"/>
-              </w:rPr>
-              <w:t xml:space="preserve">3</w:t>
-            </w:r>
-          </w:p>
-        </w:tc>
-      </w:tr>
-      <w:tr>
-        <w:trPr>
-          <w:cantSplit/>
-        </w:trPr>
-        <w:tc>
-          <w:tcPr>
-            <w:tcW w:w="1828" w:type="pct"/>
-          </w:tcPr>
-          <w:p>
-            <w:pPr>
-              <w:keepNext/>
-              <w:keepLines/>
-              <w:bidi w:val="0"/>
-              <w:spacing w:after="0"/>
-              <w:rPr>
-                <w:rFonts w:asciiTheme="majorBidi" w:hAnsiTheme="majorBidi" w:cstheme="majorBidi"/>
-                <w:sz w:val="18"/>
-                <w:szCs w:val="18"/>
-              </w:rPr>
-            </w:pPr>
-            <w:r>
-              <w:rPr>
-                <w:rFonts w:asciiTheme="majorBidi" w:hAnsiTheme="majorBidi" w:cstheme="majorBidi"/>
-                <w:sz w:val="18"/>
-                <w:szCs w:val="18"/>
-              </w:rPr>
-              <w:t xml:space="preserve">Concepts of Programming Languages</w:t>
-            </w:r>
-          </w:p>
-        </w:tc>
-        <w:tc>
-          <w:tcPr>
-            <w:tcW w:w="338" w:type="pct"/>
-          </w:tcPr>
-          <w:p>
-            <w:pPr>
-              <w:keepNext/>
-              <w:keepLines/>
-              <w:bidi w:val="0"/>
-              <w:spacing w:after="0"/>
-              <w:rPr>
-                <w:rFonts w:asciiTheme="majorBidi" w:hAnsiTheme="majorBidi" w:cstheme="majorBidi"/>
-                <w:sz w:val="18"/>
-                <w:szCs w:val="18"/>
-              </w:rPr>
-            </w:pPr>
-            <w:r>
-              <w:rPr>
-                <w:rFonts w:asciiTheme="majorBidi" w:hAnsiTheme="majorBidi" w:cstheme="majorBidi"/>
-                <w:sz w:val="18"/>
-                <w:szCs w:val="18"/>
-              </w:rPr>
-              <w:t xml:space="preserve">50</w:t>
-            </w:r>
-          </w:p>
-        </w:tc>
-        <w:tc>
-          <w:tcPr>
-            <w:tcW w:w="339" w:type="pct"/>
-          </w:tcPr>
-          <w:p>
-            <w:pPr>
-              <w:keepNext/>
-              <w:keepLines/>
-              <w:bidi w:val="0"/>
-              <w:spacing w:after="0"/>
-              <w:rPr>
-                <w:rFonts w:asciiTheme="majorBidi" w:hAnsiTheme="majorBidi" w:cstheme="majorBidi"/>
-                <w:sz w:val="18"/>
-                <w:szCs w:val="18"/>
-              </w:rPr>
-            </w:pPr>
-            <w:r>
-              <w:rPr>
-                <w:rFonts w:asciiTheme="majorBidi" w:hAnsiTheme="majorBidi" w:cstheme="majorBidi"/>
-                <w:sz w:val="18"/>
-                <w:szCs w:val="18"/>
-              </w:rPr>
-              <w:t xml:space="preserve">2</w:t>
-            </w:r>
-          </w:p>
-        </w:tc>
-        <w:tc>
-          <w:tcPr>
-            <w:tcW w:w="1831" w:type="pct"/>
-          </w:tcPr>
-          <w:p>
-            <w:pPr>
-              <w:keepNext/>
-              <w:keepLines/>
-              <w:bidi w:val="0"/>
-              <w:spacing w:after="0"/>
-              <w:rPr>
-                <w:rFonts w:asciiTheme="majorBidi" w:hAnsiTheme="majorBidi" w:cstheme="majorBidi"/>
-                <w:sz w:val="18"/>
-                <w:szCs w:val="18"/>
-              </w:rPr>
-            </w:pPr>
-            <w:r>
-              <w:rPr>
-                <w:rFonts w:asciiTheme="majorBidi" w:hAnsiTheme="majorBidi" w:cstheme="majorBidi"/>
-                <w:sz w:val="18"/>
-                <w:szCs w:val="18"/>
-              </w:rPr>
-              <w:t xml:space="preserve">Computer Skills</w:t>
-            </w:r>
-          </w:p>
-        </w:tc>
-        <w:tc>
-          <w:tcPr>
-            <w:tcW w:w="339" w:type="pct"/>
-          </w:tcPr>
-          <w:p>
-            <w:pPr>
-              <w:keepNext/>
-              <w:keepLines/>
-              <w:bidi w:val="0"/>
-              <w:spacing w:after="0"/>
-              <w:rPr>
-                <w:rFonts w:asciiTheme="majorBidi" w:hAnsiTheme="majorBidi" w:cstheme="majorBidi"/>
-                <w:sz w:val="18"/>
-                <w:szCs w:val="18"/>
-              </w:rPr>
-            </w:pPr>
-            <w:r>
-              <w:rPr>
-                <w:rFonts w:asciiTheme="majorBidi" w:hAnsiTheme="majorBidi" w:cstheme="majorBidi"/>
-                <w:sz w:val="18"/>
-                <w:szCs w:val="18"/>
-              </w:rPr>
-              <w:t xml:space="preserve">73</w:t>
-            </w:r>
-          </w:p>
-        </w:tc>
-        <w:tc>
-          <w:tcPr>
-            <w:tcW w:w="325" w:type="pct"/>
-          </w:tcPr>
-          <w:p>
-            <w:pPr>
-              <w:keepNext/>
-              <w:keepLines/>
-              <w:bidi w:val="0"/>
-              <w:spacing w:after="0"/>
-              <w:rPr>
-                <w:rFonts w:asciiTheme="majorBidi" w:hAnsiTheme="majorBidi" w:cstheme="majorBidi"/>
-                <w:sz w:val="18"/>
-                <w:szCs w:val="18"/>
-              </w:rPr>
-            </w:pPr>
-            <w:r>
-              <w:rPr>
-                <w:rFonts w:asciiTheme="majorBidi" w:hAnsiTheme="majorBidi" w:cstheme="majorBidi"/>
-                <w:sz w:val="18"/>
-                <w:szCs w:val="18"/>
-              </w:rPr>
-              <w:t xml:space="preserve">3</w:t>
-            </w:r>
-          </w:p>
-        </w:tc>
-      </w:tr>
-      <w:tr>
-        <w:trPr>
-          <w:cantSplit/>
-        </w:trPr>
-        <w:tc>
-          <w:tcPr>
-            <w:tcW w:w="1828" w:type="pct"/>
-          </w:tcPr>
-          <w:p>
-            <w:pPr>
-              <w:keepNext/>
-              <w:keepLines/>
-              <w:bidi w:val="0"/>
-              <w:spacing w:after="0"/>
-              <w:rPr>
-                <w:rFonts w:asciiTheme="majorBidi" w:hAnsiTheme="majorBidi" w:cstheme="majorBidi"/>
-                <w:sz w:val="18"/>
-                <w:szCs w:val="18"/>
-              </w:rPr>
-            </w:pPr>
-            <w:r>
-              <w:rPr>
-                <w:rFonts w:asciiTheme="majorBidi" w:hAnsiTheme="majorBidi" w:cstheme="majorBidi"/>
-                <w:sz w:val="18"/>
-                <w:szCs w:val="18"/>
-              </w:rPr>
-              <w:t xml:space="preserve">Software Engineering</w:t>
-            </w:r>
-          </w:p>
-        </w:tc>
-        <w:tc>
-          <w:tcPr>
-            <w:tcW w:w="338" w:type="pct"/>
-          </w:tcPr>
-          <w:p>
-            <w:pPr>
-              <w:keepNext/>
-              <w:keepLines/>
-              <w:bidi w:val="0"/>
-              <w:spacing w:after="0"/>
-              <w:rPr>
-                <w:rFonts w:asciiTheme="majorBidi" w:hAnsiTheme="majorBidi" w:cstheme="majorBidi"/>
-                <w:sz w:val="18"/>
-                <w:szCs w:val="18"/>
-              </w:rPr>
-            </w:pPr>
-            <w:r>
-              <w:rPr>
-                <w:rFonts w:asciiTheme="majorBidi" w:hAnsiTheme="majorBidi" w:cstheme="majorBidi"/>
-                <w:sz w:val="18"/>
-                <w:szCs w:val="18"/>
-              </w:rPr>
-              <w:t xml:space="preserve">65</w:t>
-            </w:r>
-          </w:p>
-        </w:tc>
-        <w:tc>
-          <w:tcPr>
-            <w:tcW w:w="339" w:type="pct"/>
-          </w:tcPr>
-          <w:p>
-            <w:pPr>
-              <w:keepNext/>
-              <w:keepLines/>
-              <w:bidi w:val="0"/>
-              <w:spacing w:after="0"/>
-              <w:rPr>
-                <w:rFonts w:asciiTheme="majorBidi" w:hAnsiTheme="majorBidi" w:cstheme="majorBidi"/>
-                <w:sz w:val="18"/>
-                <w:szCs w:val="18"/>
-              </w:rPr>
-            </w:pPr>
-            <w:r>
-              <w:rPr>
-                <w:rFonts w:asciiTheme="majorBidi" w:hAnsiTheme="majorBidi" w:cstheme="majorBidi"/>
-                <w:sz w:val="18"/>
-                <w:szCs w:val="18"/>
-              </w:rPr>
-              <w:t xml:space="preserve">3</w:t>
-            </w:r>
-          </w:p>
-        </w:tc>
-        <w:tc>
-          <w:tcPr>
-            <w:tcW w:w="1831" w:type="pct"/>
-          </w:tcPr>
-          <w:p>
-            <w:pPr>
-              <w:keepNext/>
-              <w:keepLines/>
-              <w:bidi w:val="0"/>
-              <w:spacing w:after="0"/>
-              <w:rPr>
-                <w:rFonts w:asciiTheme="majorBidi" w:hAnsiTheme="majorBidi" w:cstheme="majorBidi"/>
-                <w:sz w:val="18"/>
-                <w:szCs w:val="18"/>
-              </w:rPr>
-            </w:pPr>
-            <w:r>
-              <w:rPr>
-                <w:rFonts w:asciiTheme="majorBidi" w:hAnsiTheme="majorBidi" w:cstheme="majorBidi"/>
-                <w:sz w:val="18"/>
-                <w:szCs w:val="18"/>
-              </w:rPr>
-              <w:t xml:space="preserve"/>
-            </w:r>
-          </w:p>
-        </w:tc>
-        <w:tc>
-          <w:tcPr>
-            <w:tcW w:w="339" w:type="pct"/>
-          </w:tcPr>
-          <w:p>
-            <w:pPr>
-              <w:keepNext/>
-              <w:keepLines/>
-              <w:bidi w:val="0"/>
-              <w:spacing w:after="0"/>
-              <w:rPr>
-                <w:rFonts w:asciiTheme="majorBidi" w:hAnsiTheme="majorBidi" w:cstheme="majorBidi"/>
-                <w:sz w:val="18"/>
-                <w:szCs w:val="18"/>
-              </w:rPr>
-            </w:pPr>
-            <w:r>
-              <w:rPr>
-                <w:rFonts w:asciiTheme="majorBidi" w:hAnsiTheme="majorBidi" w:cstheme="majorBidi"/>
-                <w:sz w:val="18"/>
-                <w:szCs w:val="18"/>
-              </w:rPr>
-              <w:t xml:space="preserve"/>
-            </w:r>
-          </w:p>
-        </w:tc>
-        <w:tc>
-          <w:tcPr>
-            <w:tcW w:w="325" w:type="pct"/>
-          </w:tcPr>
-          <w:p>
-            <w:pPr>
-              <w:keepNext/>
-              <w:keepLines/>
-              <w:bidi w:val="0"/>
-              <w:spacing w:after="0"/>
-              <w:rPr>
-                <w:rFonts w:asciiTheme="majorBidi" w:hAnsiTheme="majorBidi" w:cstheme="majorBidi"/>
-                <w:sz w:val="18"/>
-                <w:szCs w:val="18"/>
-              </w:rPr>
-            </w:pPr>
-            <w:r>
-              <w:rPr>
-                <w:rFonts w:asciiTheme="majorBidi" w:hAnsiTheme="majorBidi" w:cstheme="majorBidi"/>
-                <w:sz w:val="18"/>
-                <w:szCs w:val="18"/>
-              </w:rPr>
-              <w:t xml:space="preserve"/>
-            </w:r>
-          </w:p>
-        </w:tc>
-      </w:tr>
-      <w:tr>
-        <w:trPr>
-          <w:cantSplit/>
-        </w:trPr>
-        <w:tc>
-          <w:tcPr>
-            <w:tcW w:w="1828" w:type="pct"/>
-          </w:tcPr>
-          <w:p>
-            <w:pPr>
-              <w:keepNext/>
-              <w:keepLines/>
-              <w:bidi w:val="0"/>
-              <w:spacing w:after="0"/>
-              <w:rPr>
-                <w:rFonts w:asciiTheme="majorBidi" w:hAnsiTheme="majorBidi" w:cstheme="majorBidi"/>
-                <w:sz w:val="18"/>
-                <w:szCs w:val="18"/>
-              </w:rPr>
-            </w:pPr>
-            <w:r>
-              <w:rPr>
-                <w:rFonts w:asciiTheme="majorBidi" w:hAnsiTheme="majorBidi" w:cstheme="majorBidi"/>
-                <w:sz w:val="18"/>
-                <w:szCs w:val="18"/>
-              </w:rPr>
-              <w:t xml:space="preserve">Data Structures II</w:t>
-            </w:r>
-          </w:p>
-        </w:tc>
-        <w:tc>
-          <w:tcPr>
-            <w:tcW w:w="338" w:type="pct"/>
-          </w:tcPr>
-          <w:p>
-            <w:pPr>
-              <w:keepNext/>
-              <w:keepLines/>
-              <w:bidi w:val="0"/>
-              <w:spacing w:after="0"/>
-              <w:rPr>
-                <w:rFonts w:asciiTheme="majorBidi" w:hAnsiTheme="majorBidi" w:cstheme="majorBidi"/>
-                <w:sz w:val="18"/>
-                <w:szCs w:val="18"/>
-              </w:rPr>
-            </w:pPr>
-            <w:r>
-              <w:rPr>
-                <w:rFonts w:asciiTheme="majorBidi" w:hAnsiTheme="majorBidi" w:cstheme="majorBidi"/>
-                <w:sz w:val="18"/>
-                <w:szCs w:val="18"/>
-              </w:rPr>
-              <w:t xml:space="preserve">52</w:t>
-            </w:r>
-          </w:p>
-        </w:tc>
-        <w:tc>
-          <w:tcPr>
-            <w:tcW w:w="339" w:type="pct"/>
-          </w:tcPr>
-          <w:p>
-            <w:pPr>
-              <w:keepNext/>
-              <w:keepLines/>
-              <w:bidi w:val="0"/>
-              <w:spacing w:after="0"/>
-              <w:rPr>
-                <w:rFonts w:asciiTheme="majorBidi" w:hAnsiTheme="majorBidi" w:cstheme="majorBidi"/>
-                <w:sz w:val="18"/>
-                <w:szCs w:val="18"/>
-              </w:rPr>
-            </w:pPr>
-            <w:r>
-              <w:rPr>
-                <w:rFonts w:asciiTheme="majorBidi" w:hAnsiTheme="majorBidi" w:cstheme="majorBidi"/>
-                <w:sz w:val="18"/>
-                <w:szCs w:val="18"/>
-              </w:rPr>
-              <w:t xml:space="preserve">3</w:t>
-            </w:r>
-          </w:p>
-        </w:tc>
-        <w:tc>
-          <w:tcPr>
-            <w:tcW w:w="1831" w:type="pct"/>
-          </w:tcPr>
-          <w:p>
-            <w:pPr>
-              <w:keepNext/>
-              <w:keepLines/>
-              <w:bidi w:val="0"/>
-              <w:spacing w:after="0"/>
-              <w:rPr>
-                <w:rFonts w:asciiTheme="majorBidi" w:hAnsiTheme="majorBidi" w:cstheme="majorBidi"/>
-                <w:sz w:val="18"/>
-                <w:szCs w:val="18"/>
-              </w:rPr>
-            </w:pPr>
-            <w:r>
-              <w:rPr>
-                <w:rFonts w:asciiTheme="majorBidi" w:hAnsiTheme="majorBidi" w:cstheme="majorBidi"/>
-                <w:sz w:val="18"/>
-                <w:szCs w:val="18"/>
-              </w:rPr>
-              <w:t xml:space="preserve"/>
-            </w:r>
-          </w:p>
-        </w:tc>
-        <w:tc>
-          <w:tcPr>
-            <w:tcW w:w="339" w:type="pct"/>
-          </w:tcPr>
-          <w:p>
-            <w:pPr>
-              <w:keepNext/>
-              <w:keepLines/>
-              <w:bidi w:val="0"/>
-              <w:spacing w:after="0"/>
-              <w:rPr>
-                <w:rFonts w:asciiTheme="majorBidi" w:hAnsiTheme="majorBidi" w:cstheme="majorBidi"/>
-                <w:sz w:val="18"/>
-                <w:szCs w:val="18"/>
-              </w:rPr>
-            </w:pPr>
-            <w:r>
-              <w:rPr>
-                <w:rFonts w:asciiTheme="majorBidi" w:hAnsiTheme="majorBidi" w:cstheme="majorBidi"/>
-                <w:sz w:val="18"/>
-                <w:szCs w:val="18"/>
-              </w:rPr>
-              <w:t xml:space="preserve"/>
-            </w:r>
-          </w:p>
-        </w:tc>
-        <w:tc>
-          <w:tcPr>
-            <w:tcW w:w="325" w:type="pct"/>
-          </w:tcPr>
-          <w:p>
-            <w:pPr>
-              <w:keepNext/>
-              <w:keepLines/>
-              <w:bidi w:val="0"/>
-              <w:spacing w:after="0"/>
-              <w:rPr>
-                <w:rFonts w:asciiTheme="majorBidi" w:hAnsiTheme="majorBidi" w:cstheme="majorBidi"/>
-                <w:sz w:val="18"/>
-                <w:szCs w:val="18"/>
-              </w:rPr>
-            </w:pPr>
-            <w:r>
-              <w:rPr>
-                <w:rFonts w:asciiTheme="majorBidi" w:hAnsiTheme="majorBidi" w:cstheme="majorBidi"/>
-                <w:sz w:val="18"/>
-                <w:szCs w:val="18"/>
-              </w:rPr>
-              <w:t xml:space="preserve"/>
+              <w:t>3</w:t>
             </w:r>
           </w:p>
         </w:tc>
@@ -3094,2349 +1849,6 @@
         <w:bidi w:val="0"/>
         <w:spacing w:line="240" w:lineRule="auto"/>
       </w:pPr>
-      <w:r>
-        <w:t xml:space="preserve"/>
-      </w:r>
-    </w:p>
-    <w:tbl>
-      <w:tblPr>
-        <w:tblStyle w:val="TableGrid"/>
-        <w:tblW w:w="5000" w:type="pct"/>
-        <w:tblLayout w:type="fixed"/>
-        <w:tblLook w:val="04A0" w:firstRow="1" w:lastRow="0" w:firstColumn="1" w:lastColumn="0" w:noHBand="0" w:noVBand="1"/>
-      </w:tblPr>
-      <w:tblGrid>
-        <w:gridCol w:w="3822"/>
-        <w:gridCol w:w="707"/>
-        <w:gridCol w:w="709"/>
-        <w:gridCol w:w="3829"/>
-        <w:gridCol w:w="709"/>
-        <w:gridCol w:w="680"/>
-      </w:tblGrid>
-      <w:tr>
-        <w:trPr>
-          <w:cantSplit/>
-        </w:trPr>
-        <w:tc>
-          <w:tcPr>
-            <w:tcW w:w="2505" w:type="pct"/>
-            <w:gridSpan w:val="3"/>
-          </w:tcPr>
-          <w:p>
-            <w:pPr>
-              <w:keepNext/>
-              <w:keepLines/>
-              <w:bidi w:val="0"/>
-              <w:spacing w:after="0"/>
-              <w:rPr>
-                <w:rFonts w:asciiTheme="majorBidi" w:hAnsiTheme="majorBidi" w:cstheme="majorBidi"/>
-                <w:sz w:val="18"/>
-                <w:szCs w:val="18"/>
-              </w:rPr>
-            </w:pPr>
-            <w:r>
-              <w:rPr>
-                <w:rFonts w:asciiTheme="majorBidi" w:hAnsiTheme="majorBidi" w:cstheme="majorBidi"/>
-                <w:sz w:val="18"/>
-                <w:szCs w:val="18"/>
-              </w:rPr>
-              <w:t xml:space="preserve">Year: 2016-2017</w:t>
-            </w:r>
-          </w:p>
-        </w:tc>
-        <w:tc>
-          <w:tcPr>
-            <w:tcW w:w="2495" w:type="pct"/>
-            <w:gridSpan w:val="3"/>
-          </w:tcPr>
-          <w:p>
-            <w:pPr>
-              <w:keepNext/>
-              <w:keepLines/>
-              <w:bidi w:val="0"/>
-              <w:spacing w:after="0"/>
-              <w:rPr>
-                <w:rFonts w:asciiTheme="majorBidi" w:hAnsiTheme="majorBidi" w:cstheme="majorBidi"/>
-                <w:sz w:val="18"/>
-                <w:szCs w:val="18"/>
-              </w:rPr>
-            </w:pPr>
-            <w:r>
-              <w:rPr>
-                <w:rFonts w:asciiTheme="majorBidi" w:hAnsiTheme="majorBidi" w:cstheme="majorBidi"/>
-                <w:sz w:val="18"/>
-                <w:szCs w:val="18"/>
-              </w:rPr>
-              <w:t xml:space="preserve">Year: 2018-2019</w:t>
-            </w:r>
-          </w:p>
-        </w:tc>
-      </w:tr>
-      <w:tr>
-        <w:trPr>
-          <w:cantSplit/>
-        </w:trPr>
-        <w:tc>
-          <w:tcPr>
-            <w:tcW w:w="1828" w:type="pct"/>
-          </w:tcPr>
-          <w:p>
-            <w:pPr>
-              <w:keepNext/>
-              <w:keepLines/>
-              <w:bidi w:val="0"/>
-              <w:spacing w:after="0"/>
-              <w:rPr>
-                <w:rFonts w:asciiTheme="majorBidi" w:hAnsiTheme="majorBidi" w:cstheme="majorBidi"/>
-                <w:sz w:val="18"/>
-                <w:szCs w:val="18"/>
-              </w:rPr>
-            </w:pPr>
-            <w:r>
-              <w:rPr>
-                <w:rFonts w:asciiTheme="majorBidi" w:hAnsiTheme="majorBidi" w:cstheme="majorBidi"/>
-                <w:sz w:val="18"/>
-                <w:szCs w:val="18"/>
-              </w:rPr>
-              <w:t>Subject</w:t>
-            </w:r>
-          </w:p>
-        </w:tc>
-        <w:tc>
-          <w:tcPr>
-            <w:tcW w:w="338" w:type="pct"/>
-          </w:tcPr>
-          <w:p>
-            <w:pPr>
-              <w:keepNext/>
-              <w:keepLines/>
-              <w:bidi w:val="0"/>
-              <w:spacing w:after="0"/>
-              <w:rPr>
-                <w:rFonts w:asciiTheme="majorBidi" w:hAnsiTheme="majorBidi" w:cstheme="majorBidi"/>
-                <w:sz w:val="18"/>
-                <w:szCs w:val="18"/>
-              </w:rPr>
-            </w:pPr>
-            <w:r>
-              <w:rPr>
-                <w:rFonts w:asciiTheme="majorBidi" w:hAnsiTheme="majorBidi" w:cstheme="majorBidi"/>
-                <w:sz w:val="18"/>
-                <w:szCs w:val="18"/>
-              </w:rPr>
-              <w:t>Mark</w:t>
-            </w:r>
-          </w:p>
-        </w:tc>
-        <w:tc>
-          <w:tcPr>
-            <w:tcW w:w="339" w:type="pct"/>
-          </w:tcPr>
-          <w:p>
-            <w:pPr>
-              <w:keepNext/>
-              <w:keepLines/>
-              <w:bidi w:val="0"/>
-              <w:spacing w:after="0"/>
-              <w:rPr>
-                <w:rFonts w:asciiTheme="majorBidi" w:hAnsiTheme="majorBidi" w:cstheme="majorBidi"/>
-                <w:sz w:val="18"/>
-                <w:szCs w:val="18"/>
-              </w:rPr>
-            </w:pPr>
-            <w:r>
-              <w:rPr>
-                <w:rFonts w:asciiTheme="majorBidi" w:hAnsiTheme="majorBidi" w:cstheme="majorBidi"/>
-                <w:sz w:val="18"/>
-                <w:szCs w:val="18"/>
-              </w:rPr>
-              <w:t>Unit</w:t>
-            </w:r>
-          </w:p>
-        </w:tc>
-        <w:tc>
-          <w:tcPr>
-            <w:tcW w:w="1831" w:type="pct"/>
-          </w:tcPr>
-          <w:p>
-            <w:pPr>
-              <w:keepNext/>
-              <w:keepLines/>
-              <w:bidi w:val="0"/>
-              <w:spacing w:after="0"/>
-              <w:rPr>
-                <w:rFonts w:asciiTheme="majorBidi" w:hAnsiTheme="majorBidi" w:cstheme="majorBidi"/>
-                <w:sz w:val="18"/>
-                <w:szCs w:val="18"/>
-              </w:rPr>
-            </w:pPr>
-            <w:r>
-              <w:rPr>
-                <w:rFonts w:asciiTheme="majorBidi" w:hAnsiTheme="majorBidi" w:cstheme="majorBidi"/>
-                <w:sz w:val="18"/>
-                <w:szCs w:val="18"/>
-              </w:rPr>
-              <w:t>Subject</w:t>
-            </w:r>
-          </w:p>
-        </w:tc>
-        <w:tc>
-          <w:tcPr>
-            <w:tcW w:w="339" w:type="pct"/>
-          </w:tcPr>
-          <w:p>
-            <w:pPr>
-              <w:keepNext/>
-              <w:keepLines/>
-              <w:bidi w:val="0"/>
-              <w:spacing w:after="0"/>
-              <w:rPr>
-                <w:rFonts w:asciiTheme="majorBidi" w:hAnsiTheme="majorBidi" w:cstheme="majorBidi"/>
-                <w:sz w:val="18"/>
-                <w:szCs w:val="18"/>
-              </w:rPr>
-            </w:pPr>
-            <w:r>
-              <w:rPr>
-                <w:rFonts w:asciiTheme="majorBidi" w:hAnsiTheme="majorBidi" w:cstheme="majorBidi"/>
-                <w:sz w:val="18"/>
-                <w:szCs w:val="18"/>
-              </w:rPr>
-              <w:t>Mark</w:t>
-            </w:r>
-          </w:p>
-        </w:tc>
-        <w:tc>
-          <w:tcPr>
-            <w:tcW w:w="325" w:type="pct"/>
-          </w:tcPr>
-          <w:p>
-            <w:pPr>
-              <w:keepNext/>
-              <w:keepLines/>
-              <w:bidi w:val="0"/>
-              <w:spacing w:after="0"/>
-              <w:rPr>
-                <w:rFonts w:asciiTheme="majorBidi" w:hAnsiTheme="majorBidi" w:cstheme="majorBidi"/>
-                <w:sz w:val="18"/>
-                <w:szCs w:val="18"/>
-              </w:rPr>
-            </w:pPr>
-            <w:r>
-              <w:rPr>
-                <w:rFonts w:asciiTheme="majorBidi" w:hAnsiTheme="majorBidi" w:cstheme="majorBidi"/>
-                <w:sz w:val="18"/>
-                <w:szCs w:val="18"/>
-              </w:rPr>
-              <w:t>Unit</w:t>
-            </w:r>
-          </w:p>
-        </w:tc>
-      </w:tr>
-      <w:tr>
-        <w:trPr>
-          <w:cantSplit/>
-        </w:trPr>
-        <w:tc>
-          <w:tcPr>
-            <w:tcW w:w="1828" w:type="pct"/>
-          </w:tcPr>
-          <w:p>
-            <w:pPr>
-              <w:keepNext/>
-              <w:keepLines/>
-              <w:bidi w:val="0"/>
-              <w:spacing w:after="0"/>
-              <w:rPr>
-                <w:rFonts w:asciiTheme="majorBidi" w:hAnsiTheme="majorBidi" w:cstheme="majorBidi"/>
-                <w:sz w:val="18"/>
-                <w:szCs w:val="18"/>
-              </w:rPr>
-            </w:pPr>
-            <w:r>
-              <w:rPr>
-                <w:rFonts w:asciiTheme="majorBidi" w:hAnsiTheme="majorBidi" w:cstheme="majorBidi"/>
-                <w:sz w:val="18"/>
-                <w:szCs w:val="18"/>
-              </w:rPr>
-              <w:t xml:space="preserve">Probability and Statistics</w:t>
-            </w:r>
-          </w:p>
-        </w:tc>
-        <w:tc>
-          <w:tcPr>
-            <w:tcW w:w="338" w:type="pct"/>
-          </w:tcPr>
-          <w:p>
-            <w:pPr>
-              <w:keepNext/>
-              <w:keepLines/>
-              <w:bidi w:val="0"/>
-              <w:spacing w:after="0"/>
-              <w:rPr>
-                <w:rFonts w:asciiTheme="majorBidi" w:hAnsiTheme="majorBidi" w:cstheme="majorBidi"/>
-                <w:sz w:val="18"/>
-                <w:szCs w:val="18"/>
-              </w:rPr>
-            </w:pPr>
-            <w:r>
-              <w:rPr>
-                <w:rFonts w:asciiTheme="majorBidi" w:hAnsiTheme="majorBidi" w:cstheme="majorBidi"/>
-                <w:sz w:val="18"/>
-                <w:szCs w:val="18"/>
-              </w:rPr>
-              <w:t xml:space="preserve">53</w:t>
-            </w:r>
-          </w:p>
-        </w:tc>
-        <w:tc>
-          <w:tcPr>
-            <w:tcW w:w="339" w:type="pct"/>
-          </w:tcPr>
-          <w:p>
-            <w:pPr>
-              <w:keepNext/>
-              <w:keepLines/>
-              <w:bidi w:val="0"/>
-              <w:spacing w:after="0"/>
-              <w:rPr>
-                <w:rFonts w:asciiTheme="majorBidi" w:hAnsiTheme="majorBidi" w:cstheme="majorBidi"/>
-                <w:sz w:val="18"/>
-                <w:szCs w:val="18"/>
-              </w:rPr>
-            </w:pPr>
-            <w:r>
-              <w:rPr>
-                <w:rFonts w:asciiTheme="majorBidi" w:hAnsiTheme="majorBidi" w:cstheme="majorBidi"/>
-                <w:sz w:val="18"/>
-                <w:szCs w:val="18"/>
-              </w:rPr>
-              <w:t xml:space="preserve">3</w:t>
-            </w:r>
-          </w:p>
-        </w:tc>
-        <w:tc>
-          <w:tcPr>
-            <w:tcW w:w="1831" w:type="pct"/>
-          </w:tcPr>
-          <w:p>
-            <w:pPr>
-              <w:keepNext/>
-              <w:keepLines/>
-              <w:bidi w:val="0"/>
-              <w:spacing w:after="0"/>
-              <w:rPr>
-                <w:rFonts w:asciiTheme="majorBidi" w:hAnsiTheme="majorBidi" w:cstheme="majorBidi"/>
-                <w:sz w:val="18"/>
-                <w:szCs w:val="18"/>
-              </w:rPr>
-            </w:pPr>
-            <w:r>
-              <w:rPr>
-                <w:rFonts w:asciiTheme="majorBidi" w:hAnsiTheme="majorBidi" w:cstheme="majorBidi"/>
-                <w:sz w:val="18"/>
-                <w:szCs w:val="18"/>
-              </w:rPr>
-              <w:t xml:space="preserve">Cloud Computing</w:t>
-            </w:r>
-          </w:p>
-        </w:tc>
-        <w:tc>
-          <w:tcPr>
-            <w:tcW w:w="339" w:type="pct"/>
-          </w:tcPr>
-          <w:p>
-            <w:pPr>
-              <w:keepNext/>
-              <w:keepLines/>
-              <w:bidi w:val="0"/>
-              <w:spacing w:after="0"/>
-              <w:rPr>
-                <w:rFonts w:asciiTheme="majorBidi" w:hAnsiTheme="majorBidi" w:cstheme="majorBidi"/>
-                <w:sz w:val="18"/>
-                <w:szCs w:val="18"/>
-              </w:rPr>
-            </w:pPr>
-            <w:r>
-              <w:rPr>
-                <w:rFonts w:asciiTheme="majorBidi" w:hAnsiTheme="majorBidi" w:cstheme="majorBidi"/>
-                <w:sz w:val="18"/>
-                <w:szCs w:val="18"/>
-              </w:rPr>
-              <w:t xml:space="preserve">84</w:t>
-            </w:r>
-          </w:p>
-        </w:tc>
-        <w:tc>
-          <w:tcPr>
-            <w:tcW w:w="325" w:type="pct"/>
-          </w:tcPr>
-          <w:p>
-            <w:pPr>
-              <w:keepNext/>
-              <w:keepLines/>
-              <w:bidi w:val="0"/>
-              <w:spacing w:after="0"/>
-              <w:rPr>
-                <w:rFonts w:asciiTheme="majorBidi" w:hAnsiTheme="majorBidi" w:cstheme="majorBidi"/>
-                <w:sz w:val="18"/>
-                <w:szCs w:val="18"/>
-              </w:rPr>
-            </w:pPr>
-            <w:r>
-              <w:rPr>
-                <w:rFonts w:asciiTheme="majorBidi" w:hAnsiTheme="majorBidi" w:cstheme="majorBidi"/>
-                <w:sz w:val="18"/>
-                <w:szCs w:val="18"/>
-              </w:rPr>
-              <w:t xml:space="preserve">2</w:t>
-            </w:r>
-          </w:p>
-        </w:tc>
-      </w:tr>
-      <w:tr>
-        <w:trPr>
-          <w:cantSplit/>
-        </w:trPr>
-        <w:tc>
-          <w:tcPr>
-            <w:tcW w:w="1828" w:type="pct"/>
-          </w:tcPr>
-          <w:p>
-            <w:pPr>
-              <w:keepNext/>
-              <w:keepLines/>
-              <w:bidi w:val="0"/>
-              <w:spacing w:after="0"/>
-              <w:rPr>
-                <w:rFonts w:asciiTheme="majorBidi" w:hAnsiTheme="majorBidi" w:cstheme="majorBidi"/>
-                <w:sz w:val="18"/>
-                <w:szCs w:val="18"/>
-              </w:rPr>
-            </w:pPr>
-            <w:r>
-              <w:rPr>
-                <w:rFonts w:asciiTheme="majorBidi" w:hAnsiTheme="majorBidi" w:cstheme="majorBidi"/>
-                <w:sz w:val="18"/>
-                <w:szCs w:val="18"/>
-              </w:rPr>
-              <w:t xml:space="preserve">Object-oriented Programming I</w:t>
-            </w:r>
-          </w:p>
-        </w:tc>
-        <w:tc>
-          <w:tcPr>
-            <w:tcW w:w="338" w:type="pct"/>
-          </w:tcPr>
-          <w:p>
-            <w:pPr>
-              <w:keepNext/>
-              <w:keepLines/>
-              <w:bidi w:val="0"/>
-              <w:spacing w:after="0"/>
-              <w:rPr>
-                <w:rFonts w:asciiTheme="majorBidi" w:hAnsiTheme="majorBidi" w:cstheme="majorBidi"/>
-                <w:sz w:val="18"/>
-                <w:szCs w:val="18"/>
-              </w:rPr>
-            </w:pPr>
-            <w:r>
-              <w:rPr>
-                <w:rFonts w:asciiTheme="majorBidi" w:hAnsiTheme="majorBidi" w:cstheme="majorBidi"/>
-                <w:sz w:val="18"/>
-                <w:szCs w:val="18"/>
-              </w:rPr>
-              <w:t xml:space="preserve">53</w:t>
-            </w:r>
-          </w:p>
-        </w:tc>
-        <w:tc>
-          <w:tcPr>
-            <w:tcW w:w="339" w:type="pct"/>
-          </w:tcPr>
-          <w:p>
-            <w:pPr>
-              <w:keepNext/>
-              <w:keepLines/>
-              <w:bidi w:val="0"/>
-              <w:spacing w:after="0"/>
-              <w:rPr>
-                <w:rFonts w:asciiTheme="majorBidi" w:hAnsiTheme="majorBidi" w:cstheme="majorBidi"/>
-                <w:sz w:val="18"/>
-                <w:szCs w:val="18"/>
-              </w:rPr>
-            </w:pPr>
-            <w:r>
-              <w:rPr>
-                <w:rFonts w:asciiTheme="majorBidi" w:hAnsiTheme="majorBidi" w:cstheme="majorBidi"/>
-                <w:sz w:val="18"/>
-                <w:szCs w:val="18"/>
-              </w:rPr>
-              <w:t xml:space="preserve">3</w:t>
-            </w:r>
-          </w:p>
-        </w:tc>
-        <w:tc>
-          <w:tcPr>
-            <w:tcW w:w="1831" w:type="pct"/>
-          </w:tcPr>
-          <w:p>
-            <w:pPr>
-              <w:keepNext/>
-              <w:keepLines/>
-              <w:bidi w:val="0"/>
-              <w:spacing w:after="0"/>
-              <w:rPr>
-                <w:rFonts w:asciiTheme="majorBidi" w:hAnsiTheme="majorBidi" w:cstheme="majorBidi"/>
-                <w:sz w:val="18"/>
-                <w:szCs w:val="18"/>
-              </w:rPr>
-            </w:pPr>
-            <w:r>
-              <w:rPr>
-                <w:rFonts w:asciiTheme="majorBidi" w:hAnsiTheme="majorBidi" w:cstheme="majorBidi"/>
-                <w:sz w:val="18"/>
-                <w:szCs w:val="18"/>
-              </w:rPr>
-              <w:t xml:space="preserve">Computational Intelligence</w:t>
-            </w:r>
-          </w:p>
-        </w:tc>
-        <w:tc>
-          <w:tcPr>
-            <w:tcW w:w="339" w:type="pct"/>
-          </w:tcPr>
-          <w:p>
-            <w:pPr>
-              <w:keepNext/>
-              <w:keepLines/>
-              <w:bidi w:val="0"/>
-              <w:spacing w:after="0"/>
-              <w:rPr>
-                <w:rFonts w:asciiTheme="majorBidi" w:hAnsiTheme="majorBidi" w:cstheme="majorBidi"/>
-                <w:sz w:val="18"/>
-                <w:szCs w:val="18"/>
-              </w:rPr>
-            </w:pPr>
-            <w:r>
-              <w:rPr>
-                <w:rFonts w:asciiTheme="majorBidi" w:hAnsiTheme="majorBidi" w:cstheme="majorBidi"/>
-                <w:sz w:val="18"/>
-                <w:szCs w:val="18"/>
-              </w:rPr>
-              <w:t xml:space="preserve">68</w:t>
-            </w:r>
-          </w:p>
-        </w:tc>
-        <w:tc>
-          <w:tcPr>
-            <w:tcW w:w="325" w:type="pct"/>
-          </w:tcPr>
-          <w:p>
-            <w:pPr>
-              <w:keepNext/>
-              <w:keepLines/>
-              <w:bidi w:val="0"/>
-              <w:spacing w:after="0"/>
-              <w:rPr>
-                <w:rFonts w:asciiTheme="majorBidi" w:hAnsiTheme="majorBidi" w:cstheme="majorBidi"/>
-                <w:sz w:val="18"/>
-                <w:szCs w:val="18"/>
-              </w:rPr>
-            </w:pPr>
-            <w:r>
-              <w:rPr>
-                <w:rFonts w:asciiTheme="majorBidi" w:hAnsiTheme="majorBidi" w:cstheme="majorBidi"/>
-                <w:sz w:val="18"/>
-                <w:szCs w:val="18"/>
-              </w:rPr>
-              <w:t xml:space="preserve">3</w:t>
-            </w:r>
-          </w:p>
-        </w:tc>
-      </w:tr>
-      <w:tr>
-        <w:trPr>
-          <w:cantSplit/>
-        </w:trPr>
-        <w:tc>
-          <w:tcPr>
-            <w:tcW w:w="1828" w:type="pct"/>
-          </w:tcPr>
-          <w:p>
-            <w:pPr>
-              <w:keepNext/>
-              <w:keepLines/>
-              <w:bidi w:val="0"/>
-              <w:spacing w:after="0"/>
-              <w:rPr>
-                <w:rFonts w:asciiTheme="majorBidi" w:hAnsiTheme="majorBidi" w:cstheme="majorBidi"/>
-                <w:sz w:val="18"/>
-                <w:szCs w:val="18"/>
-              </w:rPr>
-            </w:pPr>
-            <w:r>
-              <w:rPr>
-                <w:rFonts w:asciiTheme="majorBidi" w:hAnsiTheme="majorBidi" w:cstheme="majorBidi"/>
-                <w:sz w:val="18"/>
-                <w:szCs w:val="18"/>
-              </w:rPr>
-              <w:t xml:space="preserve">Object-oriented Programming II</w:t>
-            </w:r>
-          </w:p>
-        </w:tc>
-        <w:tc>
-          <w:tcPr>
-            <w:tcW w:w="338" w:type="pct"/>
-          </w:tcPr>
-          <w:p>
-            <w:pPr>
-              <w:keepNext/>
-              <w:keepLines/>
-              <w:bidi w:val="0"/>
-              <w:spacing w:after="0"/>
-              <w:rPr>
-                <w:rFonts w:asciiTheme="majorBidi" w:hAnsiTheme="majorBidi" w:cstheme="majorBidi"/>
-                <w:sz w:val="18"/>
-                <w:szCs w:val="18"/>
-              </w:rPr>
-            </w:pPr>
-            <w:r>
-              <w:rPr>
-                <w:rFonts w:asciiTheme="majorBidi" w:hAnsiTheme="majorBidi" w:cstheme="majorBidi"/>
-                <w:sz w:val="18"/>
-                <w:szCs w:val="18"/>
-              </w:rPr>
-              <w:t xml:space="preserve">51</w:t>
-            </w:r>
-          </w:p>
-        </w:tc>
-        <w:tc>
-          <w:tcPr>
-            <w:tcW w:w="339" w:type="pct"/>
-          </w:tcPr>
-          <w:p>
-            <w:pPr>
-              <w:keepNext/>
-              <w:keepLines/>
-              <w:bidi w:val="0"/>
-              <w:spacing w:after="0"/>
-              <w:rPr>
-                <w:rFonts w:asciiTheme="majorBidi" w:hAnsiTheme="majorBidi" w:cstheme="majorBidi"/>
-                <w:sz w:val="18"/>
-                <w:szCs w:val="18"/>
-              </w:rPr>
-            </w:pPr>
-            <w:r>
-              <w:rPr>
-                <w:rFonts w:asciiTheme="majorBidi" w:hAnsiTheme="majorBidi" w:cstheme="majorBidi"/>
-                <w:sz w:val="18"/>
-                <w:szCs w:val="18"/>
-              </w:rPr>
-              <w:t xml:space="preserve">3</w:t>
-            </w:r>
-          </w:p>
-        </w:tc>
-        <w:tc>
-          <w:tcPr>
-            <w:tcW w:w="1831" w:type="pct"/>
-          </w:tcPr>
-          <w:p>
-            <w:pPr>
-              <w:keepNext/>
-              <w:keepLines/>
-              <w:bidi w:val="0"/>
-              <w:spacing w:after="0"/>
-              <w:rPr>
-                <w:rFonts w:asciiTheme="majorBidi" w:hAnsiTheme="majorBidi" w:cstheme="majorBidi"/>
-                <w:sz w:val="18"/>
-                <w:szCs w:val="18"/>
-              </w:rPr>
-            </w:pPr>
-            <w:r>
-              <w:rPr>
-                <w:rFonts w:asciiTheme="majorBidi" w:hAnsiTheme="majorBidi" w:cstheme="majorBidi"/>
-                <w:sz w:val="18"/>
-                <w:szCs w:val="18"/>
-              </w:rPr>
-              <w:t xml:space="preserve">Computer Vision</w:t>
-            </w:r>
-          </w:p>
-        </w:tc>
-        <w:tc>
-          <w:tcPr>
-            <w:tcW w:w="339" w:type="pct"/>
-          </w:tcPr>
-          <w:p>
-            <w:pPr>
-              <w:keepNext/>
-              <w:keepLines/>
-              <w:bidi w:val="0"/>
-              <w:spacing w:after="0"/>
-              <w:rPr>
-                <w:rFonts w:asciiTheme="majorBidi" w:hAnsiTheme="majorBidi" w:cstheme="majorBidi"/>
-                <w:sz w:val="18"/>
-                <w:szCs w:val="18"/>
-              </w:rPr>
-            </w:pPr>
-            <w:r>
-              <w:rPr>
-                <w:rFonts w:asciiTheme="majorBidi" w:hAnsiTheme="majorBidi" w:cstheme="majorBidi"/>
-                <w:sz w:val="18"/>
-                <w:szCs w:val="18"/>
-              </w:rPr>
-              <w:t xml:space="preserve">78</w:t>
-            </w:r>
-          </w:p>
-        </w:tc>
-        <w:tc>
-          <w:tcPr>
-            <w:tcW w:w="325" w:type="pct"/>
-          </w:tcPr>
-          <w:p>
-            <w:pPr>
-              <w:keepNext/>
-              <w:keepLines/>
-              <w:bidi w:val="0"/>
-              <w:spacing w:after="0"/>
-              <w:rPr>
-                <w:rFonts w:asciiTheme="majorBidi" w:hAnsiTheme="majorBidi" w:cstheme="majorBidi"/>
-                <w:sz w:val="18"/>
-                <w:szCs w:val="18"/>
-              </w:rPr>
-            </w:pPr>
-            <w:r>
-              <w:rPr>
-                <w:rFonts w:asciiTheme="majorBidi" w:hAnsiTheme="majorBidi" w:cstheme="majorBidi"/>
-                <w:sz w:val="18"/>
-                <w:szCs w:val="18"/>
-              </w:rPr>
-              <w:t xml:space="preserve">3</w:t>
-            </w:r>
-          </w:p>
-        </w:tc>
-      </w:tr>
-      <w:tr>
-        <w:trPr>
-          <w:cantSplit/>
-        </w:trPr>
-        <w:tc>
-          <w:tcPr>
-            <w:tcW w:w="1828" w:type="pct"/>
-          </w:tcPr>
-          <w:p>
-            <w:pPr>
-              <w:keepNext/>
-              <w:keepLines/>
-              <w:bidi w:val="0"/>
-              <w:spacing w:after="0"/>
-              <w:rPr>
-                <w:rFonts w:asciiTheme="majorBidi" w:hAnsiTheme="majorBidi" w:cstheme="majorBidi"/>
-                <w:sz w:val="18"/>
-                <w:szCs w:val="18"/>
-              </w:rPr>
-            </w:pPr>
-            <w:r>
-              <w:rPr>
-                <w:rFonts w:asciiTheme="majorBidi" w:hAnsiTheme="majorBidi" w:cstheme="majorBidi"/>
-                <w:sz w:val="18"/>
-                <w:szCs w:val="18"/>
-              </w:rPr>
-              <w:t xml:space="preserve">Visual Programming</w:t>
-            </w:r>
-          </w:p>
-        </w:tc>
-        <w:tc>
-          <w:tcPr>
-            <w:tcW w:w="338" w:type="pct"/>
-          </w:tcPr>
-          <w:p>
-            <w:pPr>
-              <w:keepNext/>
-              <w:keepLines/>
-              <w:bidi w:val="0"/>
-              <w:spacing w:after="0"/>
-              <w:rPr>
-                <w:rFonts w:asciiTheme="majorBidi" w:hAnsiTheme="majorBidi" w:cstheme="majorBidi"/>
-                <w:sz w:val="18"/>
-                <w:szCs w:val="18"/>
-              </w:rPr>
-            </w:pPr>
-            <w:r>
-              <w:rPr>
-                <w:rFonts w:asciiTheme="majorBidi" w:hAnsiTheme="majorBidi" w:cstheme="majorBidi"/>
-                <w:sz w:val="18"/>
-                <w:szCs w:val="18"/>
-              </w:rPr>
-              <w:t xml:space="preserve">50</w:t>
-            </w:r>
-          </w:p>
-        </w:tc>
-        <w:tc>
-          <w:tcPr>
-            <w:tcW w:w="339" w:type="pct"/>
-          </w:tcPr>
-          <w:p>
-            <w:pPr>
-              <w:keepNext/>
-              <w:keepLines/>
-              <w:bidi w:val="0"/>
-              <w:spacing w:after="0"/>
-              <w:rPr>
-                <w:rFonts w:asciiTheme="majorBidi" w:hAnsiTheme="majorBidi" w:cstheme="majorBidi"/>
-                <w:sz w:val="18"/>
-                <w:szCs w:val="18"/>
-              </w:rPr>
-            </w:pPr>
-            <w:r>
-              <w:rPr>
-                <w:rFonts w:asciiTheme="majorBidi" w:hAnsiTheme="majorBidi" w:cstheme="majorBidi"/>
-                <w:sz w:val="18"/>
-                <w:szCs w:val="18"/>
-              </w:rPr>
-              <w:t xml:space="preserve">3</w:t>
-            </w:r>
-          </w:p>
-        </w:tc>
-        <w:tc>
-          <w:tcPr>
-            <w:tcW w:w="1831" w:type="pct"/>
-          </w:tcPr>
-          <w:p>
-            <w:pPr>
-              <w:keepNext/>
-              <w:keepLines/>
-              <w:bidi w:val="0"/>
-              <w:spacing w:after="0"/>
-              <w:rPr>
-                <w:rFonts w:asciiTheme="majorBidi" w:hAnsiTheme="majorBidi" w:cstheme="majorBidi"/>
-                <w:sz w:val="18"/>
-                <w:szCs w:val="18"/>
-              </w:rPr>
-            </w:pPr>
-            <w:r>
-              <w:rPr>
-                <w:rFonts w:asciiTheme="majorBidi" w:hAnsiTheme="majorBidi" w:cstheme="majorBidi"/>
-                <w:sz w:val="18"/>
-                <w:szCs w:val="18"/>
-              </w:rPr>
-              <w:t xml:space="preserve">Computer Simulation</w:t>
-            </w:r>
-          </w:p>
-        </w:tc>
-        <w:tc>
-          <w:tcPr>
-            <w:tcW w:w="339" w:type="pct"/>
-          </w:tcPr>
-          <w:p>
-            <w:pPr>
-              <w:keepNext/>
-              <w:keepLines/>
-              <w:bidi w:val="0"/>
-              <w:spacing w:after="0"/>
-              <w:rPr>
-                <w:rFonts w:asciiTheme="majorBidi" w:hAnsiTheme="majorBidi" w:cstheme="majorBidi"/>
-                <w:sz w:val="18"/>
-                <w:szCs w:val="18"/>
-              </w:rPr>
-            </w:pPr>
-            <w:r>
-              <w:rPr>
-                <w:rFonts w:asciiTheme="majorBidi" w:hAnsiTheme="majorBidi" w:cstheme="majorBidi"/>
-                <w:sz w:val="18"/>
-                <w:szCs w:val="18"/>
-              </w:rPr>
-              <w:t xml:space="preserve">80</w:t>
-            </w:r>
-          </w:p>
-        </w:tc>
-        <w:tc>
-          <w:tcPr>
-            <w:tcW w:w="325" w:type="pct"/>
-          </w:tcPr>
-          <w:p>
-            <w:pPr>
-              <w:keepNext/>
-              <w:keepLines/>
-              <w:bidi w:val="0"/>
-              <w:spacing w:after="0"/>
-              <w:rPr>
-                <w:rFonts w:asciiTheme="majorBidi" w:hAnsiTheme="majorBidi" w:cstheme="majorBidi"/>
-                <w:sz w:val="18"/>
-                <w:szCs w:val="18"/>
-              </w:rPr>
-            </w:pPr>
-            <w:r>
-              <w:rPr>
-                <w:rFonts w:asciiTheme="majorBidi" w:hAnsiTheme="majorBidi" w:cstheme="majorBidi"/>
-                <w:sz w:val="18"/>
-                <w:szCs w:val="18"/>
-              </w:rPr>
-              <w:t xml:space="preserve">3</w:t>
-            </w:r>
-          </w:p>
-        </w:tc>
-      </w:tr>
-      <w:tr>
-        <w:trPr>
-          <w:cantSplit/>
-        </w:trPr>
-        <w:tc>
-          <w:tcPr>
-            <w:tcW w:w="1828" w:type="pct"/>
-          </w:tcPr>
-          <w:p>
-            <w:pPr>
-              <w:keepNext/>
-              <w:keepLines/>
-              <w:bidi w:val="0"/>
-              <w:spacing w:after="0"/>
-              <w:rPr>
-                <w:rFonts w:asciiTheme="majorBidi" w:hAnsiTheme="majorBidi" w:cstheme="majorBidi"/>
-                <w:sz w:val="18"/>
-                <w:szCs w:val="18"/>
-              </w:rPr>
-            </w:pPr>
-            <w:r>
-              <w:rPr>
-                <w:rFonts w:asciiTheme="majorBidi" w:hAnsiTheme="majorBidi" w:cstheme="majorBidi"/>
-                <w:sz w:val="18"/>
-                <w:szCs w:val="18"/>
-              </w:rPr>
-              <w:t xml:space="preserve">Computer Graphics</w:t>
-            </w:r>
-          </w:p>
-        </w:tc>
-        <w:tc>
-          <w:tcPr>
-            <w:tcW w:w="338" w:type="pct"/>
-          </w:tcPr>
-          <w:p>
-            <w:pPr>
-              <w:keepNext/>
-              <w:keepLines/>
-              <w:bidi w:val="0"/>
-              <w:spacing w:after="0"/>
-              <w:rPr>
-                <w:rFonts w:asciiTheme="majorBidi" w:hAnsiTheme="majorBidi" w:cstheme="majorBidi"/>
-                <w:sz w:val="18"/>
-                <w:szCs w:val="18"/>
-              </w:rPr>
-            </w:pPr>
-            <w:r>
-              <w:rPr>
-                <w:rFonts w:asciiTheme="majorBidi" w:hAnsiTheme="majorBidi" w:cstheme="majorBidi"/>
-                <w:sz w:val="18"/>
-                <w:szCs w:val="18"/>
-              </w:rPr>
-              <w:t xml:space="preserve">63</w:t>
-            </w:r>
-          </w:p>
-        </w:tc>
-        <w:tc>
-          <w:tcPr>
-            <w:tcW w:w="339" w:type="pct"/>
-          </w:tcPr>
-          <w:p>
-            <w:pPr>
-              <w:keepNext/>
-              <w:keepLines/>
-              <w:bidi w:val="0"/>
-              <w:spacing w:after="0"/>
-              <w:rPr>
-                <w:rFonts w:asciiTheme="majorBidi" w:hAnsiTheme="majorBidi" w:cstheme="majorBidi"/>
-                <w:sz w:val="18"/>
-                <w:szCs w:val="18"/>
-              </w:rPr>
-            </w:pPr>
-            <w:r>
-              <w:rPr>
-                <w:rFonts w:asciiTheme="majorBidi" w:hAnsiTheme="majorBidi" w:cstheme="majorBidi"/>
-                <w:sz w:val="18"/>
-                <w:szCs w:val="18"/>
-              </w:rPr>
-              <w:t xml:space="preserve">3</w:t>
-            </w:r>
-          </w:p>
-        </w:tc>
-        <w:tc>
-          <w:tcPr>
-            <w:tcW w:w="1831" w:type="pct"/>
-          </w:tcPr>
-          <w:p>
-            <w:pPr>
-              <w:keepNext/>
-              <w:keepLines/>
-              <w:bidi w:val="0"/>
-              <w:spacing w:after="0"/>
-              <w:rPr>
-                <w:rFonts w:asciiTheme="majorBidi" w:hAnsiTheme="majorBidi" w:cstheme="majorBidi"/>
-                <w:sz w:val="18"/>
-                <w:szCs w:val="18"/>
-              </w:rPr>
-            </w:pPr>
-            <w:r>
-              <w:rPr>
-                <w:rFonts w:asciiTheme="majorBidi" w:hAnsiTheme="majorBidi" w:cstheme="majorBidi"/>
-                <w:sz w:val="18"/>
-                <w:szCs w:val="18"/>
-              </w:rPr>
-              <w:t xml:space="preserve">Computer Security</w:t>
-            </w:r>
-          </w:p>
-        </w:tc>
-        <w:tc>
-          <w:tcPr>
-            <w:tcW w:w="339" w:type="pct"/>
-          </w:tcPr>
-          <w:p>
-            <w:pPr>
-              <w:keepNext/>
-              <w:keepLines/>
-              <w:bidi w:val="0"/>
-              <w:spacing w:after="0"/>
-              <w:rPr>
-                <w:rFonts w:asciiTheme="majorBidi" w:hAnsiTheme="majorBidi" w:cstheme="majorBidi"/>
-                <w:sz w:val="18"/>
-                <w:szCs w:val="18"/>
-              </w:rPr>
-            </w:pPr>
-            <w:r>
-              <w:rPr>
-                <w:rFonts w:asciiTheme="majorBidi" w:hAnsiTheme="majorBidi" w:cstheme="majorBidi"/>
-                <w:sz w:val="18"/>
-                <w:szCs w:val="18"/>
-              </w:rPr>
-              <w:t xml:space="preserve">80</w:t>
-            </w:r>
-          </w:p>
-        </w:tc>
-        <w:tc>
-          <w:tcPr>
-            <w:tcW w:w="325" w:type="pct"/>
-          </w:tcPr>
-          <w:p>
-            <w:pPr>
-              <w:keepNext/>
-              <w:keepLines/>
-              <w:bidi w:val="0"/>
-              <w:spacing w:after="0"/>
-              <w:rPr>
-                <w:rFonts w:asciiTheme="majorBidi" w:hAnsiTheme="majorBidi" w:cstheme="majorBidi"/>
-                <w:sz w:val="18"/>
-                <w:szCs w:val="18"/>
-              </w:rPr>
-            </w:pPr>
-            <w:r>
-              <w:rPr>
-                <w:rFonts w:asciiTheme="majorBidi" w:hAnsiTheme="majorBidi" w:cstheme="majorBidi"/>
-                <w:sz w:val="18"/>
-                <w:szCs w:val="18"/>
-              </w:rPr>
-              <w:t xml:space="preserve">3</w:t>
-            </w:r>
-          </w:p>
-        </w:tc>
-      </w:tr>
-      <w:tr>
-        <w:trPr>
-          <w:cantSplit/>
-        </w:trPr>
-        <w:tc>
-          <w:tcPr>
-            <w:tcW w:w="1828" w:type="pct"/>
-          </w:tcPr>
-          <w:p>
-            <w:pPr>
-              <w:keepNext/>
-              <w:keepLines/>
-              <w:bidi w:val="0"/>
-              <w:spacing w:after="0"/>
-              <w:rPr>
-                <w:rFonts w:asciiTheme="majorBidi" w:hAnsiTheme="majorBidi" w:cstheme="majorBidi"/>
-                <w:sz w:val="18"/>
-                <w:szCs w:val="18"/>
-              </w:rPr>
-            </w:pPr>
-            <w:r>
-              <w:rPr>
-                <w:rFonts w:asciiTheme="majorBidi" w:hAnsiTheme="majorBidi" w:cstheme="majorBidi"/>
-                <w:sz w:val="18"/>
-                <w:szCs w:val="18"/>
-              </w:rPr>
-              <w:t xml:space="preserve">Numerical Methods</w:t>
-            </w:r>
-          </w:p>
-        </w:tc>
-        <w:tc>
-          <w:tcPr>
-            <w:tcW w:w="338" w:type="pct"/>
-          </w:tcPr>
-          <w:p>
-            <w:pPr>
-              <w:keepNext/>
-              <w:keepLines/>
-              <w:bidi w:val="0"/>
-              <w:spacing w:after="0"/>
-              <w:rPr>
-                <w:rFonts w:asciiTheme="majorBidi" w:hAnsiTheme="majorBidi" w:cstheme="majorBidi"/>
-                <w:sz w:val="18"/>
-                <w:szCs w:val="18"/>
-              </w:rPr>
-            </w:pPr>
-            <w:r>
-              <w:rPr>
-                <w:rFonts w:asciiTheme="majorBidi" w:hAnsiTheme="majorBidi" w:cstheme="majorBidi"/>
-                <w:sz w:val="18"/>
-                <w:szCs w:val="18"/>
-              </w:rPr>
-              <w:t xml:space="preserve">66</w:t>
-            </w:r>
-          </w:p>
-        </w:tc>
-        <w:tc>
-          <w:tcPr>
-            <w:tcW w:w="339" w:type="pct"/>
-          </w:tcPr>
-          <w:p>
-            <w:pPr>
-              <w:keepNext/>
-              <w:keepLines/>
-              <w:bidi w:val="0"/>
-              <w:spacing w:after="0"/>
-              <w:rPr>
-                <w:rFonts w:asciiTheme="majorBidi" w:hAnsiTheme="majorBidi" w:cstheme="majorBidi"/>
-                <w:sz w:val="18"/>
-                <w:szCs w:val="18"/>
-              </w:rPr>
-            </w:pPr>
-            <w:r>
-              <w:rPr>
-                <w:rFonts w:asciiTheme="majorBidi" w:hAnsiTheme="majorBidi" w:cstheme="majorBidi"/>
-                <w:sz w:val="18"/>
-                <w:szCs w:val="18"/>
-              </w:rPr>
-              <w:t xml:space="preserve">3</w:t>
-            </w:r>
-          </w:p>
-        </w:tc>
-        <w:tc>
-          <w:tcPr>
-            <w:tcW w:w="1831" w:type="pct"/>
-          </w:tcPr>
-          <w:p>
-            <w:pPr>
-              <w:keepNext/>
-              <w:keepLines/>
-              <w:bidi w:val="0"/>
-              <w:spacing w:after="0"/>
-              <w:rPr>
-                <w:rFonts w:asciiTheme="majorBidi" w:hAnsiTheme="majorBidi" w:cstheme="majorBidi"/>
-                <w:sz w:val="18"/>
-                <w:szCs w:val="18"/>
-              </w:rPr>
-            </w:pPr>
-            <w:r>
-              <w:rPr>
-                <w:rFonts w:asciiTheme="majorBidi" w:hAnsiTheme="majorBidi" w:cstheme="majorBidi"/>
-                <w:sz w:val="18"/>
-                <w:szCs w:val="18"/>
-              </w:rPr>
-              <w:t xml:space="preserve">Operating Systems</w:t>
-            </w:r>
-          </w:p>
-        </w:tc>
-        <w:tc>
-          <w:tcPr>
-            <w:tcW w:w="339" w:type="pct"/>
-          </w:tcPr>
-          <w:p>
-            <w:pPr>
-              <w:keepNext/>
-              <w:keepLines/>
-              <w:bidi w:val="0"/>
-              <w:spacing w:after="0"/>
-              <w:rPr>
-                <w:rFonts w:asciiTheme="majorBidi" w:hAnsiTheme="majorBidi" w:cstheme="majorBidi"/>
-                <w:sz w:val="18"/>
-                <w:szCs w:val="18"/>
-              </w:rPr>
-            </w:pPr>
-            <w:r>
-              <w:rPr>
-                <w:rFonts w:asciiTheme="majorBidi" w:hAnsiTheme="majorBidi" w:cstheme="majorBidi"/>
-                <w:sz w:val="18"/>
-                <w:szCs w:val="18"/>
-              </w:rPr>
-              <w:t xml:space="preserve">80</w:t>
-            </w:r>
-          </w:p>
-        </w:tc>
-        <w:tc>
-          <w:tcPr>
-            <w:tcW w:w="325" w:type="pct"/>
-          </w:tcPr>
-          <w:p>
-            <w:pPr>
-              <w:keepNext/>
-              <w:keepLines/>
-              <w:bidi w:val="0"/>
-              <w:spacing w:after="0"/>
-              <w:rPr>
-                <w:rFonts w:asciiTheme="majorBidi" w:hAnsiTheme="majorBidi" w:cstheme="majorBidi"/>
-                <w:sz w:val="18"/>
-                <w:szCs w:val="18"/>
-              </w:rPr>
-            </w:pPr>
-            <w:r>
-              <w:rPr>
-                <w:rFonts w:asciiTheme="majorBidi" w:hAnsiTheme="majorBidi" w:cstheme="majorBidi"/>
-                <w:sz w:val="18"/>
-                <w:szCs w:val="18"/>
-              </w:rPr>
-              <w:t xml:space="preserve">3</w:t>
-            </w:r>
-          </w:p>
-        </w:tc>
-      </w:tr>
-      <w:tr>
-        <w:trPr>
-          <w:cantSplit/>
-        </w:trPr>
-        <w:tc>
-          <w:tcPr>
-            <w:tcW w:w="1828" w:type="pct"/>
-          </w:tcPr>
-          <w:p>
-            <w:pPr>
-              <w:keepNext/>
-              <w:keepLines/>
-              <w:bidi w:val="0"/>
-              <w:spacing w:after="0"/>
-              <w:rPr>
-                <w:rFonts w:asciiTheme="majorBidi" w:hAnsiTheme="majorBidi" w:cstheme="majorBidi"/>
-                <w:sz w:val="18"/>
-                <w:szCs w:val="18"/>
-              </w:rPr>
-            </w:pPr>
-            <w:r>
-              <w:rPr>
-                <w:rFonts w:asciiTheme="majorBidi" w:hAnsiTheme="majorBidi" w:cstheme="majorBidi"/>
-                <w:sz w:val="18"/>
-                <w:szCs w:val="18"/>
-              </w:rPr>
-              <w:t xml:space="preserve">Arabic</w:t>
-            </w:r>
-          </w:p>
-        </w:tc>
-        <w:tc>
-          <w:tcPr>
-            <w:tcW w:w="338" w:type="pct"/>
-          </w:tcPr>
-          <w:p>
-            <w:pPr>
-              <w:keepNext/>
-              <w:keepLines/>
-              <w:bidi w:val="0"/>
-              <w:spacing w:after="0"/>
-              <w:rPr>
-                <w:rFonts w:asciiTheme="majorBidi" w:hAnsiTheme="majorBidi" w:cstheme="majorBidi"/>
-                <w:sz w:val="18"/>
-                <w:szCs w:val="18"/>
-              </w:rPr>
-            </w:pPr>
-            <w:r>
-              <w:rPr>
-                <w:rFonts w:asciiTheme="majorBidi" w:hAnsiTheme="majorBidi" w:cstheme="majorBidi"/>
-                <w:sz w:val="18"/>
-                <w:szCs w:val="18"/>
-              </w:rPr>
-              <w:t xml:space="preserve">70</w:t>
-            </w:r>
-          </w:p>
-        </w:tc>
-        <w:tc>
-          <w:tcPr>
-            <w:tcW w:w="339" w:type="pct"/>
-          </w:tcPr>
-          <w:p>
-            <w:pPr>
-              <w:keepNext/>
-              <w:keepLines/>
-              <w:bidi w:val="0"/>
-              <w:spacing w:after="0"/>
-              <w:rPr>
-                <w:rFonts w:asciiTheme="majorBidi" w:hAnsiTheme="majorBidi" w:cstheme="majorBidi"/>
-                <w:sz w:val="18"/>
-                <w:szCs w:val="18"/>
-              </w:rPr>
-            </w:pPr>
-            <w:r>
-              <w:rPr>
-                <w:rFonts w:asciiTheme="majorBidi" w:hAnsiTheme="majorBidi" w:cstheme="majorBidi"/>
-                <w:sz w:val="18"/>
-                <w:szCs w:val="18"/>
-              </w:rPr>
-              <w:t xml:space="preserve">2</w:t>
-            </w:r>
-          </w:p>
-        </w:tc>
-        <w:tc>
-          <w:tcPr>
-            <w:tcW w:w="1831" w:type="pct"/>
-          </w:tcPr>
-          <w:p>
-            <w:pPr>
-              <w:keepNext/>
-              <w:keepLines/>
-              <w:bidi w:val="0"/>
-              <w:spacing w:after="0"/>
-              <w:rPr>
-                <w:rFonts w:asciiTheme="majorBidi" w:hAnsiTheme="majorBidi" w:cstheme="majorBidi"/>
-                <w:sz w:val="18"/>
-                <w:szCs w:val="18"/>
-              </w:rPr>
-            </w:pPr>
-            <w:r>
-              <w:rPr>
-                <w:rFonts w:asciiTheme="majorBidi" w:hAnsiTheme="majorBidi" w:cstheme="majorBidi"/>
-                <w:sz w:val="18"/>
-                <w:szCs w:val="18"/>
-              </w:rPr>
-              <w:t xml:space="preserve">Mobile Applications</w:t>
-            </w:r>
-          </w:p>
-        </w:tc>
-        <w:tc>
-          <w:tcPr>
-            <w:tcW w:w="339" w:type="pct"/>
-          </w:tcPr>
-          <w:p>
-            <w:pPr>
-              <w:keepNext/>
-              <w:keepLines/>
-              <w:bidi w:val="0"/>
-              <w:spacing w:after="0"/>
-              <w:rPr>
-                <w:rFonts w:asciiTheme="majorBidi" w:hAnsiTheme="majorBidi" w:cstheme="majorBidi"/>
-                <w:sz w:val="18"/>
-                <w:szCs w:val="18"/>
-              </w:rPr>
-            </w:pPr>
-            <w:r>
-              <w:rPr>
-                <w:rFonts w:asciiTheme="majorBidi" w:hAnsiTheme="majorBidi" w:cstheme="majorBidi"/>
-                <w:sz w:val="18"/>
-                <w:szCs w:val="18"/>
-              </w:rPr>
-              <w:t xml:space="preserve">90</w:t>
-            </w:r>
-          </w:p>
-        </w:tc>
-        <w:tc>
-          <w:tcPr>
-            <w:tcW w:w="325" w:type="pct"/>
-          </w:tcPr>
-          <w:p>
-            <w:pPr>
-              <w:keepNext/>
-              <w:keepLines/>
-              <w:bidi w:val="0"/>
-              <w:spacing w:after="0"/>
-              <w:rPr>
-                <w:rFonts w:asciiTheme="majorBidi" w:hAnsiTheme="majorBidi" w:cstheme="majorBidi"/>
-                <w:sz w:val="18"/>
-                <w:szCs w:val="18"/>
-              </w:rPr>
-            </w:pPr>
-            <w:r>
-              <w:rPr>
-                <w:rFonts w:asciiTheme="majorBidi" w:hAnsiTheme="majorBidi" w:cstheme="majorBidi"/>
-                <w:sz w:val="18"/>
-                <w:szCs w:val="18"/>
-              </w:rPr>
-              <w:t xml:space="preserve">3</w:t>
-            </w:r>
-          </w:p>
-        </w:tc>
-      </w:tr>
-      <w:tr>
-        <w:trPr>
-          <w:cantSplit/>
-        </w:trPr>
-        <w:tc>
-          <w:tcPr>
-            <w:tcW w:w="1828" w:type="pct"/>
-          </w:tcPr>
-          <w:p>
-            <w:pPr>
-              <w:keepNext/>
-              <w:keepLines/>
-              <w:bidi w:val="0"/>
-              <w:spacing w:after="0"/>
-              <w:rPr>
-                <w:rFonts w:asciiTheme="majorBidi" w:hAnsiTheme="majorBidi" w:cstheme="majorBidi"/>
-                <w:sz w:val="18"/>
-                <w:szCs w:val="18"/>
-              </w:rPr>
-            </w:pPr>
-            <w:r>
-              <w:rPr>
-                <w:rFonts w:asciiTheme="majorBidi" w:hAnsiTheme="majorBidi" w:cstheme="majorBidi"/>
-                <w:sz w:val="18"/>
-                <w:szCs w:val="18"/>
-              </w:rPr>
-              <w:t xml:space="preserve">Microprocessors</w:t>
-            </w:r>
-          </w:p>
-        </w:tc>
-        <w:tc>
-          <w:tcPr>
-            <w:tcW w:w="338" w:type="pct"/>
-          </w:tcPr>
-          <w:p>
-            <w:pPr>
-              <w:keepNext/>
-              <w:keepLines/>
-              <w:bidi w:val="0"/>
-              <w:spacing w:after="0"/>
-              <w:rPr>
-                <w:rFonts w:asciiTheme="majorBidi" w:hAnsiTheme="majorBidi" w:cstheme="majorBidi"/>
-                <w:sz w:val="18"/>
-                <w:szCs w:val="18"/>
-              </w:rPr>
-            </w:pPr>
-            <w:r>
-              <w:rPr>
-                <w:rFonts w:asciiTheme="majorBidi" w:hAnsiTheme="majorBidi" w:cstheme="majorBidi"/>
-                <w:sz w:val="18"/>
-                <w:szCs w:val="18"/>
-              </w:rPr>
-              <w:t xml:space="preserve">50</w:t>
-            </w:r>
-          </w:p>
-        </w:tc>
-        <w:tc>
-          <w:tcPr>
-            <w:tcW w:w="339" w:type="pct"/>
-          </w:tcPr>
-          <w:p>
-            <w:pPr>
-              <w:keepNext/>
-              <w:keepLines/>
-              <w:bidi w:val="0"/>
-              <w:spacing w:after="0"/>
-              <w:rPr>
-                <w:rFonts w:asciiTheme="majorBidi" w:hAnsiTheme="majorBidi" w:cstheme="majorBidi"/>
-                <w:sz w:val="18"/>
-                <w:szCs w:val="18"/>
-              </w:rPr>
-            </w:pPr>
-            <w:r>
-              <w:rPr>
-                <w:rFonts w:asciiTheme="majorBidi" w:hAnsiTheme="majorBidi" w:cstheme="majorBidi"/>
-                <w:sz w:val="18"/>
-                <w:szCs w:val="18"/>
-              </w:rPr>
-              <w:t xml:space="preserve">3</w:t>
-            </w:r>
-          </w:p>
-        </w:tc>
-        <w:tc>
-          <w:tcPr>
-            <w:tcW w:w="1831" w:type="pct"/>
-          </w:tcPr>
-          <w:p>
-            <w:pPr>
-              <w:keepNext/>
-              <w:keepLines/>
-              <w:bidi w:val="0"/>
-              <w:spacing w:after="0"/>
-              <w:rPr>
-                <w:rFonts w:asciiTheme="majorBidi" w:hAnsiTheme="majorBidi" w:cstheme="majorBidi"/>
-                <w:sz w:val="18"/>
-                <w:szCs w:val="18"/>
-              </w:rPr>
-            </w:pPr>
-            <w:r>
-              <w:rPr>
-                <w:rFonts w:asciiTheme="majorBidi" w:hAnsiTheme="majorBidi" w:cstheme="majorBidi"/>
-                <w:sz w:val="18"/>
-                <w:szCs w:val="18"/>
-              </w:rPr>
-              <w:t xml:space="preserve">Human-Computer Interaction</w:t>
-            </w:r>
-          </w:p>
-        </w:tc>
-        <w:tc>
-          <w:tcPr>
-            <w:tcW w:w="339" w:type="pct"/>
-          </w:tcPr>
-          <w:p>
-            <w:pPr>
-              <w:keepNext/>
-              <w:keepLines/>
-              <w:bidi w:val="0"/>
-              <w:spacing w:after="0"/>
-              <w:rPr>
-                <w:rFonts w:asciiTheme="majorBidi" w:hAnsiTheme="majorBidi" w:cstheme="majorBidi"/>
-                <w:sz w:val="18"/>
-                <w:szCs w:val="18"/>
-              </w:rPr>
-            </w:pPr>
-            <w:r>
-              <w:rPr>
-                <w:rFonts w:asciiTheme="majorBidi" w:hAnsiTheme="majorBidi" w:cstheme="majorBidi"/>
-                <w:sz w:val="18"/>
-                <w:szCs w:val="18"/>
-              </w:rPr>
-              <w:t xml:space="preserve">80</w:t>
-            </w:r>
-          </w:p>
-        </w:tc>
-        <w:tc>
-          <w:tcPr>
-            <w:tcW w:w="325" w:type="pct"/>
-          </w:tcPr>
-          <w:p>
-            <w:pPr>
-              <w:keepNext/>
-              <w:keepLines/>
-              <w:bidi w:val="0"/>
-              <w:spacing w:after="0"/>
-              <w:rPr>
-                <w:rFonts w:asciiTheme="majorBidi" w:hAnsiTheme="majorBidi" w:cstheme="majorBidi"/>
-                <w:sz w:val="18"/>
-                <w:szCs w:val="18"/>
-              </w:rPr>
-            </w:pPr>
-            <w:r>
-              <w:rPr>
-                <w:rFonts w:asciiTheme="majorBidi" w:hAnsiTheme="majorBidi" w:cstheme="majorBidi"/>
-                <w:sz w:val="18"/>
-                <w:szCs w:val="18"/>
-              </w:rPr>
-              <w:t xml:space="preserve">3</w:t>
-            </w:r>
-          </w:p>
-        </w:tc>
-      </w:tr>
-      <w:tr>
-        <w:trPr>
-          <w:cantSplit/>
-        </w:trPr>
-        <w:tc>
-          <w:tcPr>
-            <w:tcW w:w="1828" w:type="pct"/>
-          </w:tcPr>
-          <w:p>
-            <w:pPr>
-              <w:keepNext/>
-              <w:keepLines/>
-              <w:bidi w:val="0"/>
-              <w:spacing w:after="0"/>
-              <w:rPr>
-                <w:rFonts w:asciiTheme="majorBidi" w:hAnsiTheme="majorBidi" w:cstheme="majorBidi"/>
-                <w:sz w:val="18"/>
-                <w:szCs w:val="18"/>
-              </w:rPr>
-            </w:pPr>
-            <w:r>
-              <w:rPr>
-                <w:rFonts w:asciiTheme="majorBidi" w:hAnsiTheme="majorBidi" w:cstheme="majorBidi"/>
-                <w:sz w:val="18"/>
-                <w:szCs w:val="18"/>
-              </w:rPr>
-              <w:t xml:space="preserve">Computation Theory</w:t>
-            </w:r>
-          </w:p>
-        </w:tc>
-        <w:tc>
-          <w:tcPr>
-            <w:tcW w:w="338" w:type="pct"/>
-          </w:tcPr>
-          <w:p>
-            <w:pPr>
-              <w:keepNext/>
-              <w:keepLines/>
-              <w:bidi w:val="0"/>
-              <w:spacing w:after="0"/>
-              <w:rPr>
-                <w:rFonts w:asciiTheme="majorBidi" w:hAnsiTheme="majorBidi" w:cstheme="majorBidi"/>
-                <w:sz w:val="18"/>
-                <w:szCs w:val="18"/>
-              </w:rPr>
-            </w:pPr>
-            <w:r>
-              <w:rPr>
-                <w:rFonts w:asciiTheme="majorBidi" w:hAnsiTheme="majorBidi" w:cstheme="majorBidi"/>
-                <w:sz w:val="18"/>
-                <w:szCs w:val="18"/>
-              </w:rPr>
-              <w:t xml:space="preserve">50</w:t>
-            </w:r>
-          </w:p>
-        </w:tc>
-        <w:tc>
-          <w:tcPr>
-            <w:tcW w:w="339" w:type="pct"/>
-          </w:tcPr>
-          <w:p>
-            <w:pPr>
-              <w:keepNext/>
-              <w:keepLines/>
-              <w:bidi w:val="0"/>
-              <w:spacing w:after="0"/>
-              <w:rPr>
-                <w:rFonts w:asciiTheme="majorBidi" w:hAnsiTheme="majorBidi" w:cstheme="majorBidi"/>
-                <w:sz w:val="18"/>
-                <w:szCs w:val="18"/>
-              </w:rPr>
-            </w:pPr>
-            <w:r>
-              <w:rPr>
-                <w:rFonts w:asciiTheme="majorBidi" w:hAnsiTheme="majorBidi" w:cstheme="majorBidi"/>
-                <w:sz w:val="18"/>
-                <w:szCs w:val="18"/>
-              </w:rPr>
-              <w:t xml:space="preserve">3</w:t>
-            </w:r>
-          </w:p>
-        </w:tc>
-        <w:tc>
-          <w:tcPr>
-            <w:tcW w:w="1831" w:type="pct"/>
-          </w:tcPr>
-          <w:p>
-            <w:pPr>
-              <w:keepNext/>
-              <w:keepLines/>
-              <w:bidi w:val="0"/>
-              <w:spacing w:after="0"/>
-              <w:rPr>
-                <w:rFonts w:asciiTheme="majorBidi" w:hAnsiTheme="majorBidi" w:cstheme="majorBidi"/>
-                <w:sz w:val="18"/>
-                <w:szCs w:val="18"/>
-              </w:rPr>
-            </w:pPr>
-            <w:r>
-              <w:rPr>
-                <w:rFonts w:asciiTheme="majorBidi" w:hAnsiTheme="majorBidi" w:cstheme="majorBidi"/>
-                <w:sz w:val="18"/>
-                <w:szCs w:val="18"/>
-              </w:rPr>
-              <w:t xml:space="preserve">Data Mining</w:t>
-            </w:r>
-          </w:p>
-        </w:tc>
-        <w:tc>
-          <w:tcPr>
-            <w:tcW w:w="339" w:type="pct"/>
-          </w:tcPr>
-          <w:p>
-            <w:pPr>
-              <w:keepNext/>
-              <w:keepLines/>
-              <w:bidi w:val="0"/>
-              <w:spacing w:after="0"/>
-              <w:rPr>
-                <w:rFonts w:asciiTheme="majorBidi" w:hAnsiTheme="majorBidi" w:cstheme="majorBidi"/>
-                <w:sz w:val="18"/>
-                <w:szCs w:val="18"/>
-              </w:rPr>
-            </w:pPr>
-            <w:r>
-              <w:rPr>
-                <w:rFonts w:asciiTheme="majorBidi" w:hAnsiTheme="majorBidi" w:cstheme="majorBidi"/>
-                <w:sz w:val="18"/>
-                <w:szCs w:val="18"/>
-              </w:rPr>
-              <w:t xml:space="preserve">89</w:t>
-            </w:r>
-          </w:p>
-        </w:tc>
-        <w:tc>
-          <w:tcPr>
-            <w:tcW w:w="325" w:type="pct"/>
-          </w:tcPr>
-          <w:p>
-            <w:pPr>
-              <w:keepNext/>
-              <w:keepLines/>
-              <w:bidi w:val="0"/>
-              <w:spacing w:after="0"/>
-              <w:rPr>
-                <w:rFonts w:asciiTheme="majorBidi" w:hAnsiTheme="majorBidi" w:cstheme="majorBidi"/>
-                <w:sz w:val="18"/>
-                <w:szCs w:val="18"/>
-              </w:rPr>
-            </w:pPr>
-            <w:r>
-              <w:rPr>
-                <w:rFonts w:asciiTheme="majorBidi" w:hAnsiTheme="majorBidi" w:cstheme="majorBidi"/>
-                <w:sz w:val="18"/>
-                <w:szCs w:val="18"/>
-              </w:rPr>
-              <w:t xml:space="preserve">2</w:t>
-            </w:r>
-          </w:p>
-        </w:tc>
-      </w:tr>
-      <w:tr>
-        <w:trPr>
-          <w:cantSplit/>
-        </w:trPr>
-        <w:tc>
-          <w:tcPr>
-            <w:tcW w:w="1828" w:type="pct"/>
-          </w:tcPr>
-          <w:p>
-            <w:pPr>
-              <w:keepNext/>
-              <w:keepLines/>
-              <w:bidi w:val="0"/>
-              <w:spacing w:after="0"/>
-              <w:rPr>
-                <w:rFonts w:asciiTheme="majorBidi" w:hAnsiTheme="majorBidi" w:cstheme="majorBidi"/>
-                <w:sz w:val="18"/>
-                <w:szCs w:val="18"/>
-              </w:rPr>
-            </w:pPr>
-            <w:r>
-              <w:rPr>
-                <w:rFonts w:asciiTheme="majorBidi" w:hAnsiTheme="majorBidi" w:cstheme="majorBidi"/>
-                <w:sz w:val="18"/>
-                <w:szCs w:val="18"/>
-              </w:rPr>
-              <w:t xml:space="preserve">Data Structures I</w:t>
-            </w:r>
-          </w:p>
-        </w:tc>
-        <w:tc>
-          <w:tcPr>
-            <w:tcW w:w="338" w:type="pct"/>
-          </w:tcPr>
-          <w:p>
-            <w:pPr>
-              <w:keepNext/>
-              <w:keepLines/>
-              <w:bidi w:val="0"/>
-              <w:spacing w:after="0"/>
-              <w:rPr>
-                <w:rFonts w:asciiTheme="majorBidi" w:hAnsiTheme="majorBidi" w:cstheme="majorBidi"/>
-                <w:sz w:val="18"/>
-                <w:szCs w:val="18"/>
-              </w:rPr>
-            </w:pPr>
-            <w:r>
-              <w:rPr>
-                <w:rFonts w:asciiTheme="majorBidi" w:hAnsiTheme="majorBidi" w:cstheme="majorBidi"/>
-                <w:sz w:val="18"/>
-                <w:szCs w:val="18"/>
-              </w:rPr>
-              <w:t xml:space="preserve">63</w:t>
-            </w:r>
-          </w:p>
-        </w:tc>
-        <w:tc>
-          <w:tcPr>
-            <w:tcW w:w="339" w:type="pct"/>
-          </w:tcPr>
-          <w:p>
-            <w:pPr>
-              <w:keepNext/>
-              <w:keepLines/>
-              <w:bidi w:val="0"/>
-              <w:spacing w:after="0"/>
-              <w:rPr>
-                <w:rFonts w:asciiTheme="majorBidi" w:hAnsiTheme="majorBidi" w:cstheme="majorBidi"/>
-                <w:sz w:val="18"/>
-                <w:szCs w:val="18"/>
-              </w:rPr>
-            </w:pPr>
-            <w:r>
-              <w:rPr>
-                <w:rFonts w:asciiTheme="majorBidi" w:hAnsiTheme="majorBidi" w:cstheme="majorBidi"/>
-                <w:sz w:val="18"/>
-                <w:szCs w:val="18"/>
-              </w:rPr>
-              <w:t xml:space="preserve">3</w:t>
-            </w:r>
-          </w:p>
-        </w:tc>
-        <w:tc>
-          <w:tcPr>
-            <w:tcW w:w="1831" w:type="pct"/>
-          </w:tcPr>
-          <w:p>
-            <w:pPr>
-              <w:keepNext/>
-              <w:keepLines/>
-              <w:bidi w:val="0"/>
-              <w:spacing w:after="0"/>
-              <w:rPr>
-                <w:rFonts w:asciiTheme="majorBidi" w:hAnsiTheme="majorBidi" w:cstheme="majorBidi"/>
-                <w:sz w:val="18"/>
-                <w:szCs w:val="18"/>
-              </w:rPr>
-            </w:pPr>
-            <w:r>
-              <w:rPr>
-                <w:rFonts w:asciiTheme="majorBidi" w:hAnsiTheme="majorBidi" w:cstheme="majorBidi"/>
-                <w:sz w:val="18"/>
-                <w:szCs w:val="18"/>
-              </w:rPr>
-              <w:t xml:space="preserve">Graduation Project</w:t>
-            </w:r>
-          </w:p>
-        </w:tc>
-        <w:tc>
-          <w:tcPr>
-            <w:tcW w:w="339" w:type="pct"/>
-          </w:tcPr>
-          <w:p>
-            <w:pPr>
-              <w:keepNext/>
-              <w:keepLines/>
-              <w:bidi w:val="0"/>
-              <w:spacing w:after="0"/>
-              <w:rPr>
-                <w:rFonts w:asciiTheme="majorBidi" w:hAnsiTheme="majorBidi" w:cstheme="majorBidi"/>
-                <w:sz w:val="18"/>
-                <w:szCs w:val="18"/>
-              </w:rPr>
-            </w:pPr>
-            <w:r>
-              <w:rPr>
-                <w:rFonts w:asciiTheme="majorBidi" w:hAnsiTheme="majorBidi" w:cstheme="majorBidi"/>
-                <w:sz w:val="18"/>
-                <w:szCs w:val="18"/>
-              </w:rPr>
-              <w:t xml:space="preserve">83</w:t>
-            </w:r>
-          </w:p>
-        </w:tc>
-        <w:tc>
-          <w:tcPr>
-            <w:tcW w:w="325" w:type="pct"/>
-          </w:tcPr>
-          <w:p>
-            <w:pPr>
-              <w:keepNext/>
-              <w:keepLines/>
-              <w:bidi w:val="0"/>
-              <w:spacing w:after="0"/>
-              <w:rPr>
-                <w:rFonts w:asciiTheme="majorBidi" w:hAnsiTheme="majorBidi" w:cstheme="majorBidi"/>
-                <w:sz w:val="18"/>
-                <w:szCs w:val="18"/>
-              </w:rPr>
-            </w:pPr>
-            <w:r>
-              <w:rPr>
-                <w:rFonts w:asciiTheme="majorBidi" w:hAnsiTheme="majorBidi" w:cstheme="majorBidi"/>
-                <w:sz w:val="18"/>
-                <w:szCs w:val="18"/>
-              </w:rPr>
-              <w:t xml:space="preserve">2</w:t>
-            </w:r>
-          </w:p>
-        </w:tc>
-      </w:tr>
-      <w:tr>
-        <w:trPr>
-          <w:cantSplit/>
-        </w:trPr>
-        <w:tc>
-          <w:tcPr>
-            <w:tcW w:w="1828" w:type="pct"/>
-          </w:tcPr>
-          <w:p>
-            <w:pPr>
-              <w:keepNext/>
-              <w:keepLines/>
-              <w:bidi w:val="0"/>
-              <w:spacing w:after="0"/>
-              <w:rPr>
-                <w:rFonts w:asciiTheme="majorBidi" w:hAnsiTheme="majorBidi" w:cstheme="majorBidi"/>
-                <w:sz w:val="18"/>
-                <w:szCs w:val="18"/>
-              </w:rPr>
-            </w:pPr>
-            <w:r>
-              <w:rPr>
-                <w:rFonts w:asciiTheme="majorBidi" w:hAnsiTheme="majorBidi" w:cstheme="majorBidi"/>
-                <w:sz w:val="18"/>
-                <w:szCs w:val="18"/>
-              </w:rPr>
-              <w:t xml:space="preserve"/>
-            </w:r>
-          </w:p>
-        </w:tc>
-        <w:tc>
-          <w:tcPr>
-            <w:tcW w:w="338" w:type="pct"/>
-          </w:tcPr>
-          <w:p>
-            <w:pPr>
-              <w:keepNext/>
-              <w:keepLines/>
-              <w:bidi w:val="0"/>
-              <w:spacing w:after="0"/>
-              <w:rPr>
-                <w:rFonts w:asciiTheme="majorBidi" w:hAnsiTheme="majorBidi" w:cstheme="majorBidi"/>
-                <w:sz w:val="18"/>
-                <w:szCs w:val="18"/>
-              </w:rPr>
-            </w:pPr>
-            <w:r>
-              <w:rPr>
-                <w:rFonts w:asciiTheme="majorBidi" w:hAnsiTheme="majorBidi" w:cstheme="majorBidi"/>
-                <w:sz w:val="18"/>
-                <w:szCs w:val="18"/>
-              </w:rPr>
-              <w:t xml:space="preserve"/>
-            </w:r>
-          </w:p>
-        </w:tc>
-        <w:tc>
-          <w:tcPr>
-            <w:tcW w:w="339" w:type="pct"/>
-          </w:tcPr>
-          <w:p>
-            <w:pPr>
-              <w:keepNext/>
-              <w:keepLines/>
-              <w:bidi w:val="0"/>
-              <w:spacing w:after="0"/>
-              <w:rPr>
-                <w:rFonts w:asciiTheme="majorBidi" w:hAnsiTheme="majorBidi" w:cstheme="majorBidi"/>
-                <w:sz w:val="18"/>
-                <w:szCs w:val="18"/>
-              </w:rPr>
-            </w:pPr>
-            <w:r>
-              <w:rPr>
-                <w:rFonts w:asciiTheme="majorBidi" w:hAnsiTheme="majorBidi" w:cstheme="majorBidi"/>
-                <w:sz w:val="18"/>
-                <w:szCs w:val="18"/>
-              </w:rPr>
-              <w:t xml:space="preserve"/>
-            </w:r>
-          </w:p>
-        </w:tc>
-        <w:tc>
-          <w:tcPr>
-            <w:tcW w:w="1831" w:type="pct"/>
-          </w:tcPr>
-          <w:p>
-            <w:pPr>
-              <w:keepNext/>
-              <w:keepLines/>
-              <w:bidi w:val="0"/>
-              <w:spacing w:after="0"/>
-              <w:rPr>
-                <w:rFonts w:asciiTheme="majorBidi" w:hAnsiTheme="majorBidi" w:cstheme="majorBidi"/>
-                <w:sz w:val="18"/>
-                <w:szCs w:val="18"/>
-              </w:rPr>
-            </w:pPr>
-            <w:r>
-              <w:rPr>
-                <w:rFonts w:asciiTheme="majorBidi" w:hAnsiTheme="majorBidi" w:cstheme="majorBidi"/>
-                <w:sz w:val="18"/>
-                <w:szCs w:val="18"/>
-              </w:rPr>
-              <w:t xml:space="preserve">Communication Skills</w:t>
-            </w:r>
-          </w:p>
-        </w:tc>
-        <w:tc>
-          <w:tcPr>
-            <w:tcW w:w="339" w:type="pct"/>
-          </w:tcPr>
-          <w:p>
-            <w:pPr>
-              <w:keepNext/>
-              <w:keepLines/>
-              <w:bidi w:val="0"/>
-              <w:spacing w:after="0"/>
-              <w:rPr>
-                <w:rFonts w:asciiTheme="majorBidi" w:hAnsiTheme="majorBidi" w:cstheme="majorBidi"/>
-                <w:sz w:val="18"/>
-                <w:szCs w:val="18"/>
-              </w:rPr>
-            </w:pPr>
-            <w:r>
-              <w:rPr>
-                <w:rFonts w:asciiTheme="majorBidi" w:hAnsiTheme="majorBidi" w:cstheme="majorBidi"/>
-                <w:sz w:val="18"/>
-                <w:szCs w:val="18"/>
-              </w:rPr>
-              <w:t xml:space="preserve">89</w:t>
-            </w:r>
-          </w:p>
-        </w:tc>
-        <w:tc>
-          <w:tcPr>
-            <w:tcW w:w="325" w:type="pct"/>
-          </w:tcPr>
-          <w:p>
-            <w:pPr>
-              <w:keepNext/>
-              <w:keepLines/>
-              <w:bidi w:val="0"/>
-              <w:spacing w:after="0"/>
-              <w:rPr>
-                <w:rFonts w:asciiTheme="majorBidi" w:hAnsiTheme="majorBidi" w:cstheme="majorBidi"/>
-                <w:sz w:val="18"/>
-                <w:szCs w:val="18"/>
-              </w:rPr>
-            </w:pPr>
-            <w:r>
-              <w:rPr>
-                <w:rFonts w:asciiTheme="majorBidi" w:hAnsiTheme="majorBidi" w:cstheme="majorBidi"/>
-                <w:sz w:val="18"/>
-                <w:szCs w:val="18"/>
-              </w:rPr>
-              <w:t xml:space="preserve">3</w:t>
-            </w:r>
-          </w:p>
-        </w:tc>
-      </w:tr>
-      <w:tr>
-        <w:trPr>
-          <w:cantSplit/>
-        </w:trPr>
-        <w:tc>
-          <w:tcPr>
-            <w:tcW w:w="1828" w:type="pct"/>
-          </w:tcPr>
-          <w:p>
-            <w:pPr>
-              <w:keepNext/>
-              <w:keepLines/>
-              <w:bidi w:val="0"/>
-              <w:spacing w:after="0"/>
-              <w:rPr>
-                <w:rFonts w:asciiTheme="majorBidi" w:hAnsiTheme="majorBidi" w:cstheme="majorBidi"/>
-                <w:sz w:val="18"/>
-                <w:szCs w:val="18"/>
-              </w:rPr>
-            </w:pPr>
-            <w:r>
-              <w:rPr>
-                <w:rFonts w:asciiTheme="majorBidi" w:hAnsiTheme="majorBidi" w:cstheme="majorBidi"/>
-                <w:sz w:val="18"/>
-                <w:szCs w:val="18"/>
-              </w:rPr>
-              <w:t xml:space="preserve"/>
-            </w:r>
-          </w:p>
-        </w:tc>
-        <w:tc>
-          <w:tcPr>
-            <w:tcW w:w="338" w:type="pct"/>
-          </w:tcPr>
-          <w:p>
-            <w:pPr>
-              <w:keepNext/>
-              <w:keepLines/>
-              <w:bidi w:val="0"/>
-              <w:spacing w:after="0"/>
-              <w:rPr>
-                <w:rFonts w:asciiTheme="majorBidi" w:hAnsiTheme="majorBidi" w:cstheme="majorBidi"/>
-                <w:sz w:val="18"/>
-                <w:szCs w:val="18"/>
-              </w:rPr>
-            </w:pPr>
-            <w:r>
-              <w:rPr>
-                <w:rFonts w:asciiTheme="majorBidi" w:hAnsiTheme="majorBidi" w:cstheme="majorBidi"/>
-                <w:sz w:val="18"/>
-                <w:szCs w:val="18"/>
-              </w:rPr>
-              <w:t xml:space="preserve"/>
-            </w:r>
-          </w:p>
-        </w:tc>
-        <w:tc>
-          <w:tcPr>
-            <w:tcW w:w="339" w:type="pct"/>
-          </w:tcPr>
-          <w:p>
-            <w:pPr>
-              <w:keepNext/>
-              <w:keepLines/>
-              <w:bidi w:val="0"/>
-              <w:spacing w:after="0"/>
-              <w:rPr>
-                <w:rFonts w:asciiTheme="majorBidi" w:hAnsiTheme="majorBidi" w:cstheme="majorBidi"/>
-                <w:sz w:val="18"/>
-                <w:szCs w:val="18"/>
-              </w:rPr>
-            </w:pPr>
-            <w:r>
-              <w:rPr>
-                <w:rFonts w:asciiTheme="majorBidi" w:hAnsiTheme="majorBidi" w:cstheme="majorBidi"/>
-                <w:sz w:val="18"/>
-                <w:szCs w:val="18"/>
-              </w:rPr>
-              <w:t xml:space="preserve"/>
-            </w:r>
-          </w:p>
-        </w:tc>
-        <w:tc>
-          <w:tcPr>
-            <w:tcW w:w="1831" w:type="pct"/>
-          </w:tcPr>
-          <w:p>
-            <w:pPr>
-              <w:keepNext/>
-              <w:keepLines/>
-              <w:bidi w:val="0"/>
-              <w:spacing w:after="0"/>
-              <w:rPr>
-                <w:rFonts w:asciiTheme="majorBidi" w:hAnsiTheme="majorBidi" w:cstheme="majorBidi"/>
-                <w:sz w:val="18"/>
-                <w:szCs w:val="18"/>
-              </w:rPr>
-            </w:pPr>
-            <w:r>
-              <w:rPr>
-                <w:rFonts w:asciiTheme="majorBidi" w:hAnsiTheme="majorBidi" w:cstheme="majorBidi"/>
-                <w:sz w:val="18"/>
-                <w:szCs w:val="18"/>
-              </w:rPr>
-              <w:t xml:space="preserve">Selected Topics</w:t>
-            </w:r>
-          </w:p>
-        </w:tc>
-        <w:tc>
-          <w:tcPr>
-            <w:tcW w:w="339" w:type="pct"/>
-          </w:tcPr>
-          <w:p>
-            <w:pPr>
-              <w:keepNext/>
-              <w:keepLines/>
-              <w:bidi w:val="0"/>
-              <w:spacing w:after="0"/>
-              <w:rPr>
-                <w:rFonts w:asciiTheme="majorBidi" w:hAnsiTheme="majorBidi" w:cstheme="majorBidi"/>
-                <w:sz w:val="18"/>
-                <w:szCs w:val="18"/>
-              </w:rPr>
-            </w:pPr>
-            <w:r>
-              <w:rPr>
-                <w:rFonts w:asciiTheme="majorBidi" w:hAnsiTheme="majorBidi" w:cstheme="majorBidi"/>
-                <w:sz w:val="18"/>
-                <w:szCs w:val="18"/>
-              </w:rPr>
-              <w:t xml:space="preserve">86</w:t>
-            </w:r>
-          </w:p>
-        </w:tc>
-        <w:tc>
-          <w:tcPr>
-            <w:tcW w:w="325" w:type="pct"/>
-          </w:tcPr>
-          <w:p>
-            <w:pPr>
-              <w:keepNext/>
-              <w:keepLines/>
-              <w:bidi w:val="0"/>
-              <w:spacing w:after="0"/>
-              <w:rPr>
-                <w:rFonts w:asciiTheme="majorBidi" w:hAnsiTheme="majorBidi" w:cstheme="majorBidi"/>
-                <w:sz w:val="18"/>
-                <w:szCs w:val="18"/>
-              </w:rPr>
-            </w:pPr>
-            <w:r>
-              <w:rPr>
-                <w:rFonts w:asciiTheme="majorBidi" w:hAnsiTheme="majorBidi" w:cstheme="majorBidi"/>
-                <w:sz w:val="18"/>
-                <w:szCs w:val="18"/>
-              </w:rPr>
-              <w:t xml:space="preserve">3</w:t>
-            </w:r>
-          </w:p>
-        </w:tc>
-      </w:tr>
-      <w:tr>
-        <w:trPr>
-          <w:cantSplit/>
-        </w:trPr>
-        <w:tc>
-          <w:tcPr>
-            <w:tcW w:w="1828" w:type="pct"/>
-          </w:tcPr>
-          <w:p>
-            <w:pPr>
-              <w:keepNext/>
-              <w:keepLines/>
-              <w:bidi w:val="0"/>
-              <w:spacing w:after="0"/>
-              <w:rPr>
-                <w:rFonts w:asciiTheme="majorBidi" w:hAnsiTheme="majorBidi" w:cstheme="majorBidi"/>
-                <w:sz w:val="18"/>
-                <w:szCs w:val="18"/>
-              </w:rPr>
-            </w:pPr>
-            <w:r>
-              <w:rPr>
-                <w:rFonts w:asciiTheme="majorBidi" w:hAnsiTheme="majorBidi" w:cstheme="majorBidi"/>
-                <w:sz w:val="18"/>
-                <w:szCs w:val="18"/>
-              </w:rPr>
-              <w:t xml:space="preserve"/>
-            </w:r>
-          </w:p>
-        </w:tc>
-        <w:tc>
-          <w:tcPr>
-            <w:tcW w:w="338" w:type="pct"/>
-          </w:tcPr>
-          <w:p>
-            <w:pPr>
-              <w:keepNext/>
-              <w:keepLines/>
-              <w:bidi w:val="0"/>
-              <w:spacing w:after="0"/>
-              <w:rPr>
-                <w:rFonts w:asciiTheme="majorBidi" w:hAnsiTheme="majorBidi" w:cstheme="majorBidi"/>
-                <w:sz w:val="18"/>
-                <w:szCs w:val="18"/>
-              </w:rPr>
-            </w:pPr>
-            <w:r>
-              <w:rPr>
-                <w:rFonts w:asciiTheme="majorBidi" w:hAnsiTheme="majorBidi" w:cstheme="majorBidi"/>
-                <w:sz w:val="18"/>
-                <w:szCs w:val="18"/>
-              </w:rPr>
-              <w:t xml:space="preserve"/>
-            </w:r>
-          </w:p>
-        </w:tc>
-        <w:tc>
-          <w:tcPr>
-            <w:tcW w:w="339" w:type="pct"/>
-          </w:tcPr>
-          <w:p>
-            <w:pPr>
-              <w:keepNext/>
-              <w:keepLines/>
-              <w:bidi w:val="0"/>
-              <w:spacing w:after="0"/>
-              <w:rPr>
-                <w:rFonts w:asciiTheme="majorBidi" w:hAnsiTheme="majorBidi" w:cstheme="majorBidi"/>
-                <w:sz w:val="18"/>
-                <w:szCs w:val="18"/>
-              </w:rPr>
-            </w:pPr>
-            <w:r>
-              <w:rPr>
-                <w:rFonts w:asciiTheme="majorBidi" w:hAnsiTheme="majorBidi" w:cstheme="majorBidi"/>
-                <w:sz w:val="18"/>
-                <w:szCs w:val="18"/>
-              </w:rPr>
-              <w:t xml:space="preserve"/>
-            </w:r>
-          </w:p>
-        </w:tc>
-        <w:tc>
-          <w:tcPr>
-            <w:tcW w:w="1831" w:type="pct"/>
-          </w:tcPr>
-          <w:p>
-            <w:pPr>
-              <w:keepNext/>
-              <w:keepLines/>
-              <w:bidi w:val="0"/>
-              <w:spacing w:after="0"/>
-              <w:rPr>
-                <w:rFonts w:asciiTheme="majorBidi" w:hAnsiTheme="majorBidi" w:cstheme="majorBidi"/>
-                <w:sz w:val="18"/>
-                <w:szCs w:val="18"/>
-              </w:rPr>
-            </w:pPr>
-            <w:r>
-              <w:rPr>
-                <w:rFonts w:asciiTheme="majorBidi" w:hAnsiTheme="majorBidi" w:cstheme="majorBidi"/>
-                <w:sz w:val="18"/>
-                <w:szCs w:val="18"/>
-              </w:rPr>
-              <w:t xml:space="preserve">Knowledge Engineering</w:t>
-            </w:r>
-          </w:p>
-        </w:tc>
-        <w:tc>
-          <w:tcPr>
-            <w:tcW w:w="339" w:type="pct"/>
-          </w:tcPr>
-          <w:p>
-            <w:pPr>
-              <w:keepNext/>
-              <w:keepLines/>
-              <w:bidi w:val="0"/>
-              <w:spacing w:after="0"/>
-              <w:rPr>
-                <w:rFonts w:asciiTheme="majorBidi" w:hAnsiTheme="majorBidi" w:cstheme="majorBidi"/>
-                <w:sz w:val="18"/>
-                <w:szCs w:val="18"/>
-              </w:rPr>
-            </w:pPr>
-            <w:r>
-              <w:rPr>
-                <w:rFonts w:asciiTheme="majorBidi" w:hAnsiTheme="majorBidi" w:cstheme="majorBidi"/>
-                <w:sz w:val="18"/>
-                <w:szCs w:val="18"/>
-              </w:rPr>
-              <w:t xml:space="preserve">92</w:t>
-            </w:r>
-          </w:p>
-        </w:tc>
-        <w:tc>
-          <w:tcPr>
-            <w:tcW w:w="325" w:type="pct"/>
-          </w:tcPr>
-          <w:p>
-            <w:pPr>
-              <w:keepNext/>
-              <w:keepLines/>
-              <w:bidi w:val="0"/>
-              <w:spacing w:after="0"/>
-              <w:rPr>
-                <w:rFonts w:asciiTheme="majorBidi" w:hAnsiTheme="majorBidi" w:cstheme="majorBidi"/>
-                <w:sz w:val="18"/>
-                <w:szCs w:val="18"/>
-              </w:rPr>
-            </w:pPr>
-            <w:r>
-              <w:rPr>
-                <w:rFonts w:asciiTheme="majorBidi" w:hAnsiTheme="majorBidi" w:cstheme="majorBidi"/>
-                <w:sz w:val="18"/>
-                <w:szCs w:val="18"/>
-              </w:rPr>
-              <w:t xml:space="preserve">3</w:t>
-            </w:r>
-          </w:p>
-        </w:tc>
-      </w:tr>
-    </w:tbl>
-    <w:p>
-      <w:pPr>
-        <w:keepNext/>
-        <w:keepLines/>
-        <w:bidi w:val="0"/>
-        <w:spacing w:line="240" w:lineRule="auto"/>
-      </w:pPr>
-      <w:r>
-        <w:t xml:space="preserve"/>
-      </w:r>
     </w:p>
     <w:p>
       <w:pPr>
@@ -5510,7 +1922,7 @@
                 <w:b/>
                 <w:bCs/>
               </w:rPr>
-              <w:t xml:space="preserve">Prof. Dr. Raidah S. Khudhair</w:t>
+              <w:t xml:space="preserve">  Israa F. Abed</w:t>
             </w:r>
           </w:p>
           <w:p>
@@ -5523,7 +1935,7 @@
               <w:rPr>
                 <w:rFonts w:asciiTheme="majorBidi" w:hAnsiTheme="majorBidi" w:cstheme="majorBidi"/>
               </w:rPr>
-              <w:t xml:space="preserve">Dean Assistant for Scientific Affairs and Postgraduate Studies</w:t>
+              <w:t>Graduate Officer</w:t>
             </w:r>
           </w:p>
         </w:tc>
@@ -5568,7 +1980,7 @@
                 <w:b/>
                 <w:bCs/>
               </w:rPr>
-              <w:t xml:space="preserve">Dr. Lacturer Mortaja Ali</w:t>
+              <w:t>Prof. Dr. Raidah S. Khudhair</w:t>
             </w:r>
           </w:p>
           <w:p>
@@ -5581,7 +1993,7 @@
               <w:rPr>
                 <w:rFonts w:asciiTheme="majorBidi" w:hAnsiTheme="majorBidi" w:cstheme="majorBidi"/>
               </w:rPr>
-              <w:t xml:space="preserve">Director of Registration</w:t>
+              <w:t xml:space="preserve">Dean Assistant for Scientific Affairs and Postgraduate </w:t>
             </w:r>
           </w:p>
         </w:tc>
@@ -5662,7 +2074,7 @@
                 <w:b/>
                 <w:bCs/>
               </w:rPr>
-              <w:t xml:space="preserve">Asst. Prof. Dr. Haider K. Mehbes</w:t>
+              <w:t>Asst. Prof. Dr. Haider K. Mehbes</w:t>
             </w:r>
           </w:p>
           <w:p>
@@ -5678,7 +2090,7 @@
               <w:rPr>
                 <w:rFonts w:asciiTheme="majorBidi" w:hAnsiTheme="majorBidi" w:cstheme="majorBidi"/>
               </w:rPr>
-              <w:t xml:space="preserve">Vice Chancellor for Scientific Affairs</w:t>
+              <w:t>Vice Chancellor for Scientific Affairs</w:t>
             </w:r>
           </w:p>
         </w:tc>
@@ -5749,7 +2161,7 @@
                 <w:b/>
                 <w:bCs/>
               </w:rPr>
-              <w:t xml:space="preserve">Prof. Dr. Husham K. Hashim</w:t>
+              <w:t xml:space="preserve">  Nagham B. Mahmood</w:t>
             </w:r>
           </w:p>
           <w:p>
@@ -5765,7 +2177,7 @@
               <w:rPr>
                 <w:rFonts w:asciiTheme="majorBidi" w:hAnsiTheme="majorBidi" w:cstheme="majorBidi"/>
               </w:rPr>
-              <w:t xml:space="preserve">The Dean</w:t>
+              <w:t>Certificate Arrangement</w:t>
             </w:r>
           </w:p>
         </w:tc>
@@ -5810,13 +2222,6 @@
           <w:lang w:bidi="ar-IQ"/>
         </w:rPr>
       </w:pPr>
-      <w:r>
-        <w:rPr>
-          <w:rFonts w:asciiTheme="minorBidi" w:hAnsiTheme="minorBidi" w:cstheme="minorBidi"/>
-        </w:rPr>
-        <w:lastRenderedPageBreak/>
-        <w:t xml:space="preserve"/>
-      </w:r>
     </w:p>
     <w:p>
       <w:pPr>
@@ -5874,7 +2279,7 @@
                 <w:b/>
                 <w:bCs/>
               </w:rPr>
-              <w:t xml:space="preserve"> Israa F. Abed</w:t>
+              <w:t>Professor Dr. Murtaja Ali Sari</w:t>
             </w:r>
           </w:p>
           <w:p>
@@ -5889,7 +2294,7 @@
               <w:rPr>
                 <w:rFonts w:asciiTheme="minorBidi" w:hAnsiTheme="minorBidi" w:cstheme="minorBidi"/>
               </w:rPr>
-              <w:t xml:space="preserve">Graduate Officer</w:t>
+              <w:t>Registration Manager</w:t>
             </w:r>
           </w:p>
         </w:tc>
@@ -5914,7 +2319,7 @@
                 <w:b/>
                 <w:bCs/>
               </w:rPr>
-              <w:t xml:space="preserve"> Nagham B. Mahmood</w:t>
+              <w:t>Prof. Dr. Husham K. Hashim</w:t>
             </w:r>
           </w:p>
           <w:p>
@@ -5929,7 +2334,7 @@
               <w:rPr>
                 <w:rFonts w:asciiTheme="minorBidi" w:hAnsiTheme="minorBidi" w:cstheme="minorBidi"/>
               </w:rPr>
-              <w:t xml:space="preserve">Certificate Arrangement</w:t>
+              <w:t>The Dean</w:t>
             </w:r>
           </w:p>
         </w:tc>
@@ -5951,7 +2356,7 @@
         <w:rPr>
           <w:rFonts w:asciiTheme="minorBidi" w:hAnsiTheme="minorBidi" w:cstheme="minorBidi"/>
         </w:rPr>
-        <w:t xml:space="preserve">Summer Training: The student completed the requirement of summer training in the academic year 2019.</w:t>
+        <w:t>Summer Training: The student completed the requirement of summer training in the academic year 2019.</w:t>
       </w:r>
     </w:p>
     <w:p>
@@ -5974,7 +2379,7 @@
         <w:rPr>
           <w:rFonts w:asciiTheme="minorBidi" w:hAnsiTheme="minorBidi" w:cstheme="minorBidi"/>
         </w:rPr>
-        <w:t xml:space="preserve">The University order No: 15710/13/3 in ‎2020/11/17‎</w:t>
+        <w:t>The University order No: 15710/13/3 in ‎2020/11/17‎</w:t>
       </w:r>
     </w:p>
     <w:p>
@@ -6150,11 +2555,19 @@
           <w:lang w:bidi="ar-IQ"/>
         </w:rPr>
       </w:pPr>
+      <w:proofErr w:type="spellStart"/>
       <w:r>
         <w:rPr>
           <w:rFonts w:asciiTheme="minorBidi" w:hAnsiTheme="minorBidi" w:cstheme="minorBidi"/>
         </w:rPr>
-        <w:t xml:space="preserve">Postponement_and_Failure_Years : Nill.</w:t>
+        <w:t>Postponement_and_Failure_Years</w:t>
+      </w:r>
+      <w:proofErr w:type="spellEnd"/>
+      <w:r>
+        <w:rPr>
+          <w:rFonts w:asciiTheme="minorBidi" w:hAnsiTheme="minorBidi" w:cstheme="minorBidi"/>
+        </w:rPr>
+        <w:t xml:space="preserve"> : Nill.</w:t>
       </w:r>
     </w:p>
     <w:p>
@@ -6172,11 +2585,19 @@
           <w:lang w:bidi="ar-IQ"/>
         </w:rPr>
       </w:pPr>
+      <w:proofErr w:type="spellStart"/>
       <w:r>
         <w:rPr>
           <w:rFonts w:asciiTheme="minorBidi" w:hAnsiTheme="minorBidi" w:cstheme="minorBidi"/>
         </w:rPr>
-        <w:t xml:space="preserve">Subjects_Passed_with_Second_Trial : Nill.</w:t>
+        <w:t>Subjects_Passed_with_Second_Trial</w:t>
+      </w:r>
+      <w:proofErr w:type="spellEnd"/>
+      <w:r>
+        <w:rPr>
+          <w:rFonts w:asciiTheme="minorBidi" w:hAnsiTheme="minorBidi" w:cstheme="minorBidi"/>
+        </w:rPr>
+        <w:t xml:space="preserve"> : Nill.</w:t>
       </w:r>
     </w:p>
     <w:p>
@@ -6198,7 +2619,35 @@
         <w:rPr>
           <w:rFonts w:asciiTheme="minorBidi" w:hAnsiTheme="minorBidi" w:cstheme="minorBidi"/>
         </w:rPr>
-        <w:t>The Medium Of Instruction During The Entire Was English.</w:t>
+        <w:t xml:space="preserve">The Medium </w:t>
+      </w:r>
+      <w:proofErr w:type="gramStart"/>
+      <w:r>
+        <w:rPr>
+          <w:rFonts w:asciiTheme="minorBidi" w:hAnsiTheme="minorBidi" w:cstheme="minorBidi"/>
+        </w:rPr>
+        <w:t>Of</w:t>
+      </w:r>
+      <w:proofErr w:type="gramEnd"/>
+      <w:r>
+        <w:rPr>
+          <w:rFonts w:asciiTheme="minorBidi" w:hAnsiTheme="minorBidi" w:cstheme="minorBidi"/>
+        </w:rPr>
+        <w:t xml:space="preserve"> Instruction During </w:t>
+      </w:r>
+      <w:proofErr w:type="gramStart"/>
+      <w:r>
+        <w:rPr>
+          <w:rFonts w:asciiTheme="minorBidi" w:hAnsiTheme="minorBidi" w:cstheme="minorBidi"/>
+        </w:rPr>
+        <w:t>The</w:t>
+      </w:r>
+      <w:proofErr w:type="gramEnd"/>
+      <w:r>
+        <w:rPr>
+          <w:rFonts w:asciiTheme="minorBidi" w:hAnsiTheme="minorBidi" w:cstheme="minorBidi"/>
+        </w:rPr>
+        <w:t xml:space="preserve"> Entire Was English.</w:t>
       </w:r>
     </w:p>
     <w:p>
@@ -6221,7 +2670,21 @@
         <w:rPr>
           <w:rFonts w:asciiTheme="minorBidi" w:hAnsiTheme="minorBidi" w:cstheme="minorBidi"/>
         </w:rPr>
-        <w:t>The Certificate is Free From Scratches and Corrections.</w:t>
+        <w:t xml:space="preserve">The Certificate is Free </w:t>
+      </w:r>
+      <w:proofErr w:type="gramStart"/>
+      <w:r>
+        <w:rPr>
+          <w:rFonts w:asciiTheme="minorBidi" w:hAnsiTheme="minorBidi" w:cstheme="minorBidi"/>
+        </w:rPr>
+        <w:t>From</w:t>
+      </w:r>
+      <w:proofErr w:type="gramEnd"/>
+      <w:r>
+        <w:rPr>
+          <w:rFonts w:asciiTheme="minorBidi" w:hAnsiTheme="minorBidi" w:cstheme="minorBidi"/>
+        </w:rPr>
+        <w:t xml:space="preserve"> Scratches and Corrections.</w:t>
       </w:r>
     </w:p>
     <w:p>

</xml_diff>